<commit_message>
Form ocr infos updated
</commit_message>
<xml_diff>
--- a/doc-agent-starter/forms/A2_form.docx
+++ b/doc-agent-starter/forms/A2_form.docx
@@ -468,8 +468,13 @@
           </w:tcPr>
           <w:p>
             <w:r>
-              <w:t>Fariha Ifrat</w:t>
-            </w:r>
+              <w:t xml:space="preserve">Fariha </w:t>
+            </w:r>
+            <w:proofErr w:type="spellStart"/>
+            <w:r>
+              <w:t>Ifrat</w:t>
+            </w:r>
+            <w:proofErr w:type="spellEnd"/>
           </w:p>
         </w:tc>
         <w:tc>
@@ -559,13 +564,69 @@
               <w:t xml:space="preserve">What to hand in: </w:t>
             </w:r>
             <w:r>
-              <w:t xml:space="preserve">Push everything to your team's PUBLIC GitHub repo, then tag it: git add -A &amp;&amp; git commit -m "a2-submit" &amp;&amp; git tag a2-submit &amp;&amp; git push origin main --tags. The tag IS your submission (deadlines are read from GitHub's servers) — do NOT upload a ZIP. Contents: the filled form in forms/, the repo with ingest / vision / index stages implemented, the built index (or a script that builds it), notebooks/kb_demo.ipynb showing OCR quality and one retrieval example, your updated configs/design_choices.md, and one AI-chat transcript per member. ALSO CARRIED FORWARD FROM A1 — the code stub was released after A1, so these are graded here for the first time: configs/task.yaml, data/provenance.md plus your corpus (or scripts/get_data.sh), notebooks/eda.ipynb, grading_kit/manifest.yaml, and grading_kit/heldout_pages/ with </w:t>
-            </w:r>
-            <w:proofErr w:type="gramStart"/>
+              <w:t>Push everything to your team's PUBLIC GitHub repo, then tag it: git add -A &amp;&amp; git commit -m "a2-submit" &amp;&amp; git tag a2-submit &amp;&amp; git push origin main --tags. The tag IS your submission (deadlines are read from GitHub's servers) — do NOT upload a ZIP. Contents: the filled form in forms/, the repo with ingest / vision / index stages implemented, the built index (or a script that builds it), notebooks/</w:t>
+            </w:r>
+            <w:proofErr w:type="spellStart"/>
+            <w:r>
+              <w:t>kb_demo.ipynb</w:t>
+            </w:r>
+            <w:proofErr w:type="spellEnd"/>
+            <w:r>
+              <w:t xml:space="preserve"> showing OCR quality and one retrieval example, your updated configs/design_choices.md, and one AI-chat transcript per member. ALSO CARRIED FORWARD FROM A1 — the code stub was released after A1, so these are graded here for the first time: configs/</w:t>
+            </w:r>
+            <w:proofErr w:type="spellStart"/>
+            <w:r>
+              <w:t>task.yaml</w:t>
+            </w:r>
+            <w:proofErr w:type="spellEnd"/>
+            <w:r>
+              <w:t>, data/provenance.md plus your corpus (or scripts/get_data.sh), notebooks/</w:t>
+            </w:r>
+            <w:proofErr w:type="spellStart"/>
+            <w:r>
+              <w:t>eda.ipynb</w:t>
+            </w:r>
+            <w:proofErr w:type="spellEnd"/>
+            <w:r>
+              <w:t xml:space="preserve">, </w:t>
+            </w:r>
+            <w:proofErr w:type="spellStart"/>
+            <w:r>
+              <w:t>grading_kit</w:t>
+            </w:r>
+            <w:proofErr w:type="spellEnd"/>
+            <w:r>
+              <w:t>/</w:t>
+            </w:r>
+            <w:proofErr w:type="spellStart"/>
+            <w:r>
+              <w:t>manifest.yaml</w:t>
+            </w:r>
+            <w:proofErr w:type="spellEnd"/>
+            <w:r>
+              <w:t xml:space="preserve">, and </w:t>
+            </w:r>
+            <w:proofErr w:type="spellStart"/>
+            <w:r>
+              <w:t>grading_kit</w:t>
+            </w:r>
+            <w:proofErr w:type="spellEnd"/>
+            <w:r>
+              <w:t>/</w:t>
+            </w:r>
+            <w:proofErr w:type="spellStart"/>
+            <w:r>
+              <w:t>heldout_pages</w:t>
+            </w:r>
+            <w:proofErr w:type="spellEnd"/>
+            <w:r>
+              <w:t xml:space="preserve">/ with </w:t>
+            </w:r>
+            <w:proofErr w:type="spellStart"/>
             <w:r>
               <w:t>labels.jsonl</w:t>
             </w:r>
-            <w:proofErr w:type="gramEnd"/>
+            <w:proofErr w:type="spellEnd"/>
             <w:r>
               <w:t>.</w:t>
             </w:r>
@@ -648,66 +709,9 @@
                 <w:sz w:val="18"/>
                 <w:szCs w:val="18"/>
               </w:rPr>
-              <w:t>domain · data speciality · primary NFR + target — one line each.</w:t>
-            </w:r>
-          </w:p>
-        </w:tc>
-        <w:tc>
-          <w:tcPr>
-            <w:tcW w:w="5863" w:type="dxa"/>
-            <w:tcBorders>
-              <w:top w:val="single" w:sz="4" w:space="0" w:color="000000"/>
-              <w:left w:val="single" w:sz="4" w:space="0" w:color="000000"/>
-              <w:bottom w:val="single" w:sz="4" w:space="0" w:color="000000"/>
-              <w:right w:val="single" w:sz="4" w:space="0" w:color="000000"/>
-            </w:tcBorders>
-          </w:tcPr>
-          <w:p>
-            <w:r>
-              <w:t>Domain: Bengali-medium literature education (HSC/Honours Bengali-lit students &amp; tutors, Tagore set texts).</w:t>
-            </w:r>
-          </w:p>
-          <w:p>
-            <w:r>
-              <w:t>Data speciality: dirty-ocr — IA's own OCR is the only text layer this corpus ships with; no independent gold transcription came with it.</w:t>
-            </w:r>
-          </w:p>
-          <w:p>
-            <w:r>
-              <w:t>Primary NFR: Explainable — target ECR ≥ 0.80 (page_id + line_id + verbatim span + tool trace + silver/gold evidence-tier disclosure, all four required per answer).</w:t>
-            </w:r>
-          </w:p>
-          <w:p/>
-        </w:tc>
-      </w:tr>
-      <w:tr>
-        <w:tc>
-          <w:tcPr>
-            <w:tcW w:w="3497" w:type="dxa"/>
-            <w:tcBorders>
-              <w:top w:val="single" w:sz="4" w:space="0" w:color="000000"/>
-              <w:left w:val="single" w:sz="4" w:space="0" w:color="000000"/>
-              <w:bottom w:val="single" w:sz="4" w:space="0" w:color="000000"/>
-              <w:right w:val="single" w:sz="4" w:space="0" w:color="000000"/>
-            </w:tcBorders>
-            <w:shd w:val="clear" w:color="auto" w:fill="F2F2F2"/>
-          </w:tcPr>
-          <w:p>
-            <w:pPr>
-              <w:spacing w:after="80"/>
-            </w:pPr>
-            <w:r>
-              <w:rPr>
-                <w:b/>
-                <w:bCs/>
-              </w:rPr>
-              <w:t>Success metric (from A1)</w:t>
-            </w:r>
-          </w:p>
-          <w:p>
-            <w:pPr>
-              <w:spacing w:after="80"/>
-            </w:pPr>
+              <w:t xml:space="preserve">domain · data </w:t>
+            </w:r>
+            <w:proofErr w:type="spellStart"/>
             <w:r>
               <w:rPr>
                 <w:i/>
@@ -716,57 +720,9 @@
                 <w:sz w:val="18"/>
                 <w:szCs w:val="18"/>
               </w:rPr>
-              <w:lastRenderedPageBreak/>
-              <w:t>the single answer-quality metric and target, unchanged.</w:t>
-            </w:r>
-          </w:p>
-        </w:tc>
-        <w:tc>
-          <w:tcPr>
-            <w:tcW w:w="5863" w:type="dxa"/>
-            <w:tcBorders>
-              <w:top w:val="single" w:sz="4" w:space="0" w:color="000000"/>
-              <w:left w:val="single" w:sz="4" w:space="0" w:color="000000"/>
-              <w:bottom w:val="single" w:sz="4" w:space="0" w:color="000000"/>
-              <w:right w:val="single" w:sz="4" w:space="0" w:color="000000"/>
-            </w:tcBorders>
-          </w:tcPr>
-          <w:p>
-            <w:r>
-              <w:lastRenderedPageBreak/>
-              <w:t>Explanation-Completeness Rate (ECR) ≥ 0.80 — unchanged from A1.</w:t>
-            </w:r>
-          </w:p>
-        </w:tc>
-      </w:tr>
-      <w:tr>
-        <w:tc>
-          <w:tcPr>
-            <w:tcW w:w="3497" w:type="dxa"/>
-            <w:tcBorders>
-              <w:top w:val="single" w:sz="4" w:space="0" w:color="000000"/>
-              <w:left w:val="single" w:sz="4" w:space="0" w:color="000000"/>
-              <w:bottom w:val="single" w:sz="4" w:space="0" w:color="000000"/>
-              <w:right w:val="single" w:sz="4" w:space="0" w:color="000000"/>
-            </w:tcBorders>
-            <w:shd w:val="clear" w:color="auto" w:fill="F2F2F2"/>
-          </w:tcPr>
-          <w:p>
-            <w:pPr>
-              <w:spacing w:after="80"/>
-            </w:pPr>
-            <w:r>
-              <w:rPr>
-                <w:b/>
-                <w:bCs/>
-              </w:rPr>
-              <w:t>Our corpus (from A1)</w:t>
-            </w:r>
-          </w:p>
-          <w:p>
-            <w:pPr>
-              <w:spacing w:after="80"/>
-            </w:pPr>
+              <w:t>speciality</w:t>
+            </w:r>
+            <w:proofErr w:type="spellEnd"/>
             <w:r>
               <w:rPr>
                 <w:i/>
@@ -775,6 +731,165 @@
                 <w:sz w:val="18"/>
                 <w:szCs w:val="18"/>
               </w:rPr>
+              <w:t xml:space="preserve"> · primary NFR + target — one line each.</w:t>
+            </w:r>
+          </w:p>
+        </w:tc>
+        <w:tc>
+          <w:tcPr>
+            <w:tcW w:w="5863" w:type="dxa"/>
+            <w:tcBorders>
+              <w:top w:val="single" w:sz="4" w:space="0" w:color="000000"/>
+              <w:left w:val="single" w:sz="4" w:space="0" w:color="000000"/>
+              <w:bottom w:val="single" w:sz="4" w:space="0" w:color="000000"/>
+              <w:right w:val="single" w:sz="4" w:space="0" w:color="000000"/>
+            </w:tcBorders>
+          </w:tcPr>
+          <w:p>
+            <w:r>
+              <w:t>Domain: Bengali-medium literature education (HSC/Honours Bengali-lit students &amp; tutors, Tagore set texts).</w:t>
+            </w:r>
+          </w:p>
+          <w:p>
+            <w:r>
+              <w:t xml:space="preserve">Data </w:t>
+            </w:r>
+            <w:proofErr w:type="spellStart"/>
+            <w:r>
+              <w:t>speciality</w:t>
+            </w:r>
+            <w:proofErr w:type="spellEnd"/>
+            <w:r>
+              <w:t>: dirty-</w:t>
+            </w:r>
+            <w:proofErr w:type="spellStart"/>
+            <w:r>
+              <w:t>ocr</w:t>
+            </w:r>
+            <w:proofErr w:type="spellEnd"/>
+            <w:r>
+              <w:t xml:space="preserve"> — IA's own OCR is the only text layer this corpus ships with; no independent gold transcription came with it.</w:t>
+            </w:r>
+          </w:p>
+          <w:p>
+            <w:r>
+              <w:t>Primary NFR: Explainable — target ECR ≥ 0.80 (</w:t>
+            </w:r>
+            <w:proofErr w:type="spellStart"/>
+            <w:r>
+              <w:t>page_id</w:t>
+            </w:r>
+            <w:proofErr w:type="spellEnd"/>
+            <w:r>
+              <w:t xml:space="preserve"> + </w:t>
+            </w:r>
+            <w:proofErr w:type="spellStart"/>
+            <w:r>
+              <w:t>line_id</w:t>
+            </w:r>
+            <w:proofErr w:type="spellEnd"/>
+            <w:r>
+              <w:t xml:space="preserve"> + verbatim span + tool trace + silver/gold evidence-tier disclosure, all four required per answer).</w:t>
+            </w:r>
+          </w:p>
+          <w:p/>
+        </w:tc>
+      </w:tr>
+      <w:tr>
+        <w:tc>
+          <w:tcPr>
+            <w:tcW w:w="3497" w:type="dxa"/>
+            <w:tcBorders>
+              <w:top w:val="single" w:sz="4" w:space="0" w:color="000000"/>
+              <w:left w:val="single" w:sz="4" w:space="0" w:color="000000"/>
+              <w:bottom w:val="single" w:sz="4" w:space="0" w:color="000000"/>
+              <w:right w:val="single" w:sz="4" w:space="0" w:color="000000"/>
+            </w:tcBorders>
+            <w:shd w:val="clear" w:color="auto" w:fill="F2F2F2"/>
+          </w:tcPr>
+          <w:p>
+            <w:pPr>
+              <w:spacing w:after="80"/>
+            </w:pPr>
+            <w:r>
+              <w:rPr>
+                <w:b/>
+                <w:bCs/>
+              </w:rPr>
+              <w:t>Success metric (from A1)</w:t>
+            </w:r>
+          </w:p>
+          <w:p>
+            <w:pPr>
+              <w:spacing w:after="80"/>
+            </w:pPr>
+            <w:r>
+              <w:rPr>
+                <w:i/>
+                <w:iCs/>
+                <w:color w:val="595959"/>
+                <w:sz w:val="18"/>
+                <w:szCs w:val="18"/>
+              </w:rPr>
+              <w:lastRenderedPageBreak/>
+              <w:t>the single answer-quality metric and target, unchanged.</w:t>
+            </w:r>
+          </w:p>
+        </w:tc>
+        <w:tc>
+          <w:tcPr>
+            <w:tcW w:w="5863" w:type="dxa"/>
+            <w:tcBorders>
+              <w:top w:val="single" w:sz="4" w:space="0" w:color="000000"/>
+              <w:left w:val="single" w:sz="4" w:space="0" w:color="000000"/>
+              <w:bottom w:val="single" w:sz="4" w:space="0" w:color="000000"/>
+              <w:right w:val="single" w:sz="4" w:space="0" w:color="000000"/>
+            </w:tcBorders>
+          </w:tcPr>
+          <w:p>
+            <w:r>
+              <w:lastRenderedPageBreak/>
+              <w:t>Explanation-Completeness Rate (ECR) ≥ 0.80 — unchanged from A1.</w:t>
+            </w:r>
+          </w:p>
+        </w:tc>
+      </w:tr>
+      <w:tr>
+        <w:tc>
+          <w:tcPr>
+            <w:tcW w:w="3497" w:type="dxa"/>
+            <w:tcBorders>
+              <w:top w:val="single" w:sz="4" w:space="0" w:color="000000"/>
+              <w:left w:val="single" w:sz="4" w:space="0" w:color="000000"/>
+              <w:bottom w:val="single" w:sz="4" w:space="0" w:color="000000"/>
+              <w:right w:val="single" w:sz="4" w:space="0" w:color="000000"/>
+            </w:tcBorders>
+            <w:shd w:val="clear" w:color="auto" w:fill="F2F2F2"/>
+          </w:tcPr>
+          <w:p>
+            <w:pPr>
+              <w:spacing w:after="80"/>
+            </w:pPr>
+            <w:r>
+              <w:rPr>
+                <w:b/>
+                <w:bCs/>
+              </w:rPr>
+              <w:t>Our corpus (from A1)</w:t>
+            </w:r>
+          </w:p>
+          <w:p>
+            <w:pPr>
+              <w:spacing w:after="80"/>
+            </w:pPr>
+            <w:r>
+              <w:rPr>
+                <w:i/>
+                <w:iCs/>
+                <w:color w:val="595959"/>
+                <w:sz w:val="18"/>
+                <w:szCs w:val="18"/>
+              </w:rPr>
               <w:t>source, size (pages/words), and the one thing that makes it hard to read.</w:t>
             </w:r>
           </w:p>
@@ -791,7 +906,47 @@
           </w:tcPr>
           <w:p>
             <w:r>
-              <w:t>Source: Rabindra Rachanabali (রবীন্দ্র রচনাবলী), Vol. 25, Internet Archive item RABINDRARACHANABALI, CC0-1.0. 437 scanned pages / 87,848 words / ~9MB. Hardest to read: 1950s-era Bengali letterpress printing — dense conjunct consonants (যুক্তাক্ষর) and dependent vowel signs (matras) cause character-segmentation errors in conventional OCR, compounded by aged paper and uneven illumination.</w:t>
+              <w:t xml:space="preserve">Source: Rabindra </w:t>
+            </w:r>
+            <w:proofErr w:type="spellStart"/>
+            <w:r>
+              <w:t>Rachanabali</w:t>
+            </w:r>
+            <w:proofErr w:type="spellEnd"/>
+            <w:r>
+              <w:t xml:space="preserve"> (</w:t>
+            </w:r>
+            <w:proofErr w:type="spellStart"/>
+            <w:r>
+              <w:t>রবীন্দ্র</w:t>
+            </w:r>
+            <w:proofErr w:type="spellEnd"/>
+            <w:r>
+              <w:t xml:space="preserve"> </w:t>
+            </w:r>
+            <w:proofErr w:type="spellStart"/>
+            <w:r>
+              <w:t>রচনাবলী</w:t>
+            </w:r>
+            <w:proofErr w:type="spellEnd"/>
+            <w:r>
+              <w:t>), Vol. 25, Internet Archive item RABINDRARACHANABALI, CC0-1.0. 437 scanned pages / 87,848 words / ~9MB. Hardest to read: 1950s-era Bengali letterpress printing — dense conjunct consonants (</w:t>
+            </w:r>
+            <w:proofErr w:type="spellStart"/>
+            <w:r>
+              <w:t>যুক্তাক্ষর</w:t>
+            </w:r>
+            <w:proofErr w:type="spellEnd"/>
+            <w:r>
+              <w:t>) and dependent vowel signs (</w:t>
+            </w:r>
+            <w:proofErr w:type="spellStart"/>
+            <w:r>
+              <w:t>matras</w:t>
+            </w:r>
+            <w:proofErr w:type="spellEnd"/>
+            <w:r>
+              <w:t>) cause character-segmentation errors in conventional OCR, compounded by aged paper and uneven illumination.</w:t>
             </w:r>
           </w:p>
         </w:tc>
@@ -945,7 +1100,23 @@
           </w:tcPr>
           <w:p>
             <w:r>
-              <w:t>Reading order is strictly top-to-bottom, left-to-right within a detected line band (vision/layout.py's banding sort), and Bengali conjuncts/matras span multiple Unicode codepoints per grapheme — this drives both the OCR crop padding (4px, protects ascenders/descenders at box edges) and the embedding choice (multilingual-e5-base, not an English-only encoder, since Bengali semantic similarity has no reliable proxy in English embedding space).</w:t>
+              <w:t>Reading order is strictly top-to-bottom, left-to-right within a detected line band (vision/</w:t>
+            </w:r>
+            <w:proofErr w:type="spellStart"/>
+            <w:r>
+              <w:t>layout.py's</w:t>
+            </w:r>
+            <w:proofErr w:type="spellEnd"/>
+            <w:r>
+              <w:t xml:space="preserve"> banding sort), and Bengali conjuncts/</w:t>
+            </w:r>
+            <w:proofErr w:type="spellStart"/>
+            <w:r>
+              <w:t>matras</w:t>
+            </w:r>
+            <w:proofErr w:type="spellEnd"/>
+            <w:r>
+              <w:t xml:space="preserve"> span multiple Unicode codepoints per grapheme — this drives both the OCR crop padding (4px, protects ascenders/descenders at box edges) and the embedding choice (multilingual-e5-base, not an English-only encoder, since Bengali semantic similarity has no reliable proxy in English embedding space).</w:t>
             </w:r>
           </w:p>
         </w:tc>
@@ -1002,7 +1173,15 @@
           </w:tcPr>
           <w:p>
             <w:r>
-              <w:t>Page position/orientation (deskew corrects skew &gt;0.5°), scan noise (conditional denoising via Laplacian-variance noise detection), and font/ink variation across the 6 literary works in the corpus — the OCR/index pipeline is applied uniformly regardless of which work a page belongs to.</w:t>
+              <w:t>Page position/orientation (</w:t>
+            </w:r>
+            <w:proofErr w:type="spellStart"/>
+            <w:r>
+              <w:t>deskew</w:t>
+            </w:r>
+            <w:proofErr w:type="spellEnd"/>
+            <w:r>
+              <w:t xml:space="preserve"> corrects skew &gt;0.5°), scan noise (conditional denoising via Laplacian-variance noise detection), and font/ink variation across the 6 literary works in the corpus — the OCR/index pipeline is applied uniformly regardless of which work a page belongs to.</w:t>
             </w:r>
           </w:p>
         </w:tc>
@@ -1205,15 +1384,15 @@
           </w:tcPr>
           <w:p>
             <w:r>
-              <w:t>Classical preprocessing only (deskew/denoise/binarize); the VAE/diffusion Enhancer class exists in ingest/enhance.py but its train()/</w:t>
-            </w:r>
-            <w:proofErr w:type="gramStart"/>
-            <w:r>
-              <w:t>apply(</w:t>
-            </w:r>
-            <w:proofErr w:type="gramEnd"/>
-            <w:r>
-              <w:t xml:space="preserve">) are unimplemented stubs — not attempted this milestone, flagged as a bonus we </w:t>
+              <w:t>Classical preprocessing only (</w:t>
+            </w:r>
+            <w:proofErr w:type="spellStart"/>
+            <w:r>
+              <w:t>deskew</w:t>
+            </w:r>
+            <w:proofErr w:type="spellEnd"/>
+            <w:r>
+              <w:t xml:space="preserve">/denoise/binarize); the VAE/diffusion Enhancer class exists in ingest/enhance.py but its train()/apply() are unimplemented stubs — not attempted this milestone, flagged as a bonus we </w:t>
             </w:r>
             <w:r>
               <w:lastRenderedPageBreak/>
@@ -1271,7 +1450,15 @@
           </w:tcPr>
           <w:p>
             <w:r>
-              <w:t>Options: heuristic line-grouping (Tesseract image_to_data) vs a trained detection model (Detectron2).</w:t>
+              <w:t xml:space="preserve">Options: heuristic line-grouping (Tesseract </w:t>
+            </w:r>
+            <w:proofErr w:type="spellStart"/>
+            <w:r>
+              <w:t>image_to_data</w:t>
+            </w:r>
+            <w:proofErr w:type="spellEnd"/>
+            <w:r>
+              <w:t>) vs a trained detection model (Detectron2).</w:t>
             </w:r>
           </w:p>
         </w:tc>
@@ -1289,21 +1476,13 @@
             <w:r>
               <w:t xml:space="preserve">Tesseract's own block/paragraph/line word-box grouping, banded into reading order by center-y clustering. A trained detector was scoped in </w:t>
             </w:r>
-            <w:proofErr w:type="gramStart"/>
+            <w:proofErr w:type="spellStart"/>
             <w:r>
               <w:t>config.yaml</w:t>
             </w:r>
-            <w:proofErr w:type="gramEnd"/>
-            <w:r>
-              <w:t xml:space="preserve"> (detectron</w:t>
-            </w:r>
-            <w:proofErr w:type="gramStart"/>
-            <w:r>
-              <w:t>2:layout</w:t>
-            </w:r>
-            <w:proofErr w:type="gramEnd"/>
-            <w:r>
-              <w:t>) but never wired in — A1's structure analysis found this corpus has no multi-column/table/figure layout complexity that would justify one.</w:t>
+            <w:proofErr w:type="spellEnd"/>
+            <w:r>
+              <w:t xml:space="preserve"> (detectron2:layout) but never wired in — A1's structure analysis found this corpus has no multi-column/table/figure layout complexity that would justify one.</w:t>
             </w:r>
           </w:p>
         </w:tc>
@@ -1356,7 +1535,31 @@
           </w:tcPr>
           <w:p>
             <w:r>
-              <w:t>Options: Tesseract-ben vs TrOCR (microsoft/trocr-base-printed) vs Donut.</w:t>
+              <w:t xml:space="preserve">Options: Tesseract-ben vs </w:t>
+            </w:r>
+            <w:proofErr w:type="spellStart"/>
+            <w:r>
+              <w:t>TrOCR</w:t>
+            </w:r>
+            <w:proofErr w:type="spellEnd"/>
+            <w:r>
+              <w:t xml:space="preserve"> (</w:t>
+            </w:r>
+            <w:proofErr w:type="spellStart"/>
+            <w:r>
+              <w:t>microsoft</w:t>
+            </w:r>
+            <w:proofErr w:type="spellEnd"/>
+            <w:r>
+              <w:t>/</w:t>
+            </w:r>
+            <w:proofErr w:type="spellStart"/>
+            <w:r>
+              <w:t>trocr</w:t>
+            </w:r>
+            <w:proofErr w:type="spellEnd"/>
+            <w:r>
+              <w:t>-base-printed) vs Donut.</w:t>
             </w:r>
           </w:p>
         </w:tc>
@@ -1372,15 +1575,55 @@
           </w:tcPr>
           <w:p>
             <w:r>
-              <w:t xml:space="preserve">Tesseract-ben, frozen, --oem 1 --psm 7 for per-line transcription (psm 4 for Stage 2's full-page pass). TrOCR is named in </w:t>
-            </w:r>
-            <w:proofErr w:type="gramStart"/>
+              <w:t>Tesseract-ben, frozen, --</w:t>
+            </w:r>
+            <w:proofErr w:type="spellStart"/>
+            <w:r>
+              <w:t>oem</w:t>
+            </w:r>
+            <w:proofErr w:type="spellEnd"/>
+            <w:r>
+              <w:t xml:space="preserve"> 1 --</w:t>
+            </w:r>
+            <w:proofErr w:type="spellStart"/>
+            <w:r>
+              <w:t>psm</w:t>
+            </w:r>
+            <w:proofErr w:type="spellEnd"/>
+            <w:r>
+              <w:t xml:space="preserve"> 7 for per-line transcription (</w:t>
+            </w:r>
+            <w:proofErr w:type="spellStart"/>
+            <w:r>
+              <w:t>psm</w:t>
+            </w:r>
+            <w:proofErr w:type="spellEnd"/>
+            <w:r>
+              <w:t xml:space="preserve"> 4 for Stage 2's full-page pass). </w:t>
+            </w:r>
+            <w:proofErr w:type="spellStart"/>
+            <w:r>
+              <w:t>TrOCR</w:t>
+            </w:r>
+            <w:proofErr w:type="spellEnd"/>
+            <w:r>
+              <w:t xml:space="preserve"> is named in </w:t>
+            </w:r>
+            <w:proofErr w:type="spellStart"/>
             <w:r>
               <w:t>config.yaml</w:t>
             </w:r>
-            <w:proofErr w:type="gramEnd"/>
-            <w:r>
-              <w:t xml:space="preserve"> as the aspirational baseline but was never actually wired into vision/ocr.py — every real run this milestone used Tesseract. CRNN+BiLSTM+CTC and a fine-tuned neural OCR stayed gated off pending GPU access we didn't have for A1; Kaggle GPU access is now available if we revisit this for A3.</w:t>
+            <w:proofErr w:type="spellEnd"/>
+            <w:r>
+              <w:t xml:space="preserve"> as the aspirational baseline but was never actually wired into vision/ocr.py — every real run this milestone used Tesseract. </w:t>
+            </w:r>
+            <w:proofErr w:type="spellStart"/>
+            <w:r>
+              <w:t>CRNN+BiLSTM+CTC</w:t>
+            </w:r>
+            <w:proofErr w:type="spellEnd"/>
+            <w:r>
+              <w:t xml:space="preserve"> and a fine-tuned neural OCR stayed gated off pending GPU access we didn't have for A1; Kaggle GPU access is now available if we revisit this for A3.</w:t>
             </w:r>
           </w:p>
         </w:tc>
@@ -1502,7 +1745,15 @@
           </w:tcPr>
           <w:p>
             <w:r>
-              <w:t>Options: sentence-transformers/all-MiniLM-L6-v2 (English-only, fast) vs intfloat/multilingual-e5-base.</w:t>
+              <w:t xml:space="preserve">Options: sentence-transformers/all-MiniLM-L6-v2 (English-only, fast) vs </w:t>
+            </w:r>
+            <w:proofErr w:type="spellStart"/>
+            <w:r>
+              <w:t>intfloat</w:t>
+            </w:r>
+            <w:proofErr w:type="spellEnd"/>
+            <w:r>
+              <w:t>/multilingual-e5-base.</w:t>
             </w:r>
           </w:p>
         </w:tc>
@@ -1520,11 +1771,11 @@
             <w:r>
               <w:t xml:space="preserve">multilingual-e5-base (768-dim) — the English-only model was the original </w:t>
             </w:r>
-            <w:proofErr w:type="gramStart"/>
+            <w:proofErr w:type="spellStart"/>
             <w:r>
               <w:t>config.yaml</w:t>
             </w:r>
-            <w:proofErr w:type="gramEnd"/>
+            <w:proofErr w:type="spellEnd"/>
             <w:r>
               <w:t xml:space="preserve"> default and was corrected once we recognized literary Bengali has no reliable coverage in an English-only embedding space. e5's </w:t>
             </w:r>
@@ -1600,15 +1851,39 @@
           </w:tcPr>
           <w:p>
             <w:r>
-              <w:t xml:space="preserve">FAISS HNSW (M=32, efConstruction=200) for the real corpus, with an automatic fallback to FAISS flat when the accepted-chunk count is too small to safely build an HNSW graph — we confirmed directly that faiss-cpu's IndexHNSWFlat segfaults </w:t>
-            </w:r>
-            <w:proofErr w:type="gramStart"/>
-            <w:r>
-              <w:t>when .add</w:t>
-            </w:r>
-            <w:proofErr w:type="gramEnd"/>
-            <w:r>
-              <w:t>() is called with fewer vectors than M, not a hypothetical concern.</w:t>
+              <w:t xml:space="preserve">FAISS HNSW (M=32, </w:t>
+            </w:r>
+            <w:proofErr w:type="spellStart"/>
+            <w:r>
+              <w:t>efConstruction</w:t>
+            </w:r>
+            <w:proofErr w:type="spellEnd"/>
+            <w:r>
+              <w:t xml:space="preserve">=200) for the real corpus, with an automatic fallback to FAISS flat when the accepted-chunk count is too small to safely build an HNSW graph — we confirmed directly that </w:t>
+            </w:r>
+            <w:proofErr w:type="spellStart"/>
+            <w:r>
+              <w:t>faiss-cpu's</w:t>
+            </w:r>
+            <w:proofErr w:type="spellEnd"/>
+            <w:r>
+              <w:t xml:space="preserve"> </w:t>
+            </w:r>
+            <w:proofErr w:type="spellStart"/>
+            <w:r>
+              <w:t>IndexHNSWFlat</w:t>
+            </w:r>
+            <w:proofErr w:type="spellEnd"/>
+            <w:r>
+              <w:t xml:space="preserve"> </w:t>
+            </w:r>
+            <w:proofErr w:type="spellStart"/>
+            <w:r>
+              <w:t>segfaults</w:t>
+            </w:r>
+            <w:proofErr w:type="spellEnd"/>
+            <w:r>
+              <w:t xml:space="preserve"> when .add() is called with fewer vectors than M, not a hypothetical concern.</w:t>
             </w:r>
           </w:p>
         </w:tc>
@@ -1811,7 +2086,15 @@
           </w:tcPr>
           <w:p>
             <w:r>
-              <w:t>Classical CV only (no learned model): OpenCV deskew/denoise/binarize</w:t>
+              <w:t xml:space="preserve">Classical CV only (no learned model): OpenCV </w:t>
+            </w:r>
+            <w:proofErr w:type="spellStart"/>
+            <w:r>
+              <w:t>deskew</w:t>
+            </w:r>
+            <w:proofErr w:type="spellEnd"/>
+            <w:r>
+              <w:t>/denoise/binarize</w:t>
             </w:r>
           </w:p>
         </w:tc>
@@ -1827,7 +2110,15 @@
           </w:tcPr>
           <w:p>
             <w:r>
-              <w:t>Skew threshold 0.5°; denoise triggered above Laplacian-variance 500; adaptive Gaussian threshold (blockSize=35, C=15) with Otsu fallback below std=20; blank-page drop at ink-ratio &lt;0.002</w:t>
+              <w:t>Skew threshold 0.5°; denoise triggered above Laplacian-variance 500; adaptive Gaussian threshold (</w:t>
+            </w:r>
+            <w:proofErr w:type="spellStart"/>
+            <w:r>
+              <w:t>blockSize</w:t>
+            </w:r>
+            <w:proofErr w:type="spellEnd"/>
+            <w:r>
+              <w:t>=35, C=15) with Otsu fallback below std=20; blank-page drop at ink-ratio &lt;0.002</w:t>
             </w:r>
           </w:p>
         </w:tc>
@@ -1881,7 +2172,15 @@
           </w:tcPr>
           <w:p>
             <w:r>
-              <w:t>Tesseract 4.1.1 (ben), image_to_data word/line grouping</w:t>
+              <w:t xml:space="preserve">Tesseract 4.1.1 (ben), </w:t>
+            </w:r>
+            <w:proofErr w:type="spellStart"/>
+            <w:r>
+              <w:t>image_to_data</w:t>
+            </w:r>
+            <w:proofErr w:type="spellEnd"/>
+            <w:r>
+              <w:t xml:space="preserve"> word/line grouping</w:t>
             </w:r>
           </w:p>
         </w:tc>
@@ -1897,15 +2196,39 @@
           </w:tcPr>
           <w:p>
             <w:r>
-              <w:t xml:space="preserve">--oem 1 --psm 4; score_thr=0.5; y_tolerance = </w:t>
-            </w:r>
-            <w:proofErr w:type="gramStart"/>
-            <w:r>
-              <w:t>max(</w:t>
-            </w:r>
-            <w:proofErr w:type="gramEnd"/>
-            <w:r>
-              <w:t>5px, 0.4×median line height)</w:t>
+              <w:t>--</w:t>
+            </w:r>
+            <w:proofErr w:type="spellStart"/>
+            <w:r>
+              <w:t>oem</w:t>
+            </w:r>
+            <w:proofErr w:type="spellEnd"/>
+            <w:r>
+              <w:t xml:space="preserve"> 1 --</w:t>
+            </w:r>
+            <w:proofErr w:type="spellStart"/>
+            <w:r>
+              <w:t>psm</w:t>
+            </w:r>
+            <w:proofErr w:type="spellEnd"/>
+            <w:r>
+              <w:t xml:space="preserve"> 4; </w:t>
+            </w:r>
+            <w:proofErr w:type="spellStart"/>
+            <w:r>
+              <w:t>score_thr</w:t>
+            </w:r>
+            <w:proofErr w:type="spellEnd"/>
+            <w:r>
+              <w:t xml:space="preserve">=0.5; </w:t>
+            </w:r>
+            <w:proofErr w:type="spellStart"/>
+            <w:r>
+              <w:t>y_tolerance</w:t>
+            </w:r>
+            <w:proofErr w:type="spellEnd"/>
+            <w:r>
+              <w:t xml:space="preserve"> = max(5px, 0.4×median line height)</w:t>
             </w:r>
           </w:p>
         </w:tc>
@@ -1975,7 +2298,31 @@
           </w:tcPr>
           <w:p>
             <w:r>
-              <w:t>--oem 1 --psm 7 per line; max_cer_target=0.15 (silver gate); gold gate requires exact CER=0.0 match</w:t>
+              <w:t>--</w:t>
+            </w:r>
+            <w:proofErr w:type="spellStart"/>
+            <w:r>
+              <w:t>oem</w:t>
+            </w:r>
+            <w:proofErr w:type="spellEnd"/>
+            <w:r>
+              <w:t xml:space="preserve"> 1 --</w:t>
+            </w:r>
+            <w:proofErr w:type="spellStart"/>
+            <w:r>
+              <w:t>psm</w:t>
+            </w:r>
+            <w:proofErr w:type="spellEnd"/>
+            <w:r>
+              <w:t xml:space="preserve"> 7 per line; </w:t>
+            </w:r>
+            <w:proofErr w:type="spellStart"/>
+            <w:r>
+              <w:t>max_cer_target</w:t>
+            </w:r>
+            <w:proofErr w:type="spellEnd"/>
+            <w:r>
+              <w:t>=0.15 (silver gate); gold gate requires exact CER=0.0 match</w:t>
             </w:r>
           </w:p>
         </w:tc>
@@ -2044,8 +2391,13 @@
             </w:tcBorders>
           </w:tcPr>
           <w:p>
-            <w:r>
-              <w:t>chunk_tokens=256, overlap=32</w:t>
+            <w:proofErr w:type="spellStart"/>
+            <w:r>
+              <w:t>chunk_tokens</w:t>
+            </w:r>
+            <w:proofErr w:type="spellEnd"/>
+            <w:r>
+              <w:t>=256, overlap=32</w:t>
             </w:r>
           </w:p>
         </w:tc>
@@ -2098,8 +2450,13 @@
             </w:tcBorders>
           </w:tcPr>
           <w:p>
-            <w:r>
-              <w:t>intfloat/multilingual-e5-base</w:t>
+            <w:proofErr w:type="spellStart"/>
+            <w:r>
+              <w:t>intfloat</w:t>
+            </w:r>
+            <w:proofErr w:type="spellEnd"/>
+            <w:r>
+              <w:t>/multilingual-e5-base</w:t>
             </w:r>
           </w:p>
         </w:tc>
@@ -2115,7 +2472,15 @@
           </w:tcPr>
           <w:p>
             <w:r>
-              <w:t>768-dim; batch_size=32; passage: prefix; L2-normalized output</w:t>
+              <w:t xml:space="preserve">768-dim; </w:t>
+            </w:r>
+            <w:proofErr w:type="spellStart"/>
+            <w:r>
+              <w:t>batch_size</w:t>
+            </w:r>
+            <w:proofErr w:type="spellEnd"/>
+            <w:r>
+              <w:t>=32; passage: prefix; L2-normalized output</w:t>
             </w:r>
           </w:p>
         </w:tc>
@@ -2170,7 +2535,15 @@
           </w:tcPr>
           <w:p>
             <w:r>
-              <w:t>FAISS (faiss-cpu)</w:t>
+              <w:t>FAISS (</w:t>
+            </w:r>
+            <w:proofErr w:type="spellStart"/>
+            <w:r>
+              <w:t>faiss-cpu</w:t>
+            </w:r>
+            <w:proofErr w:type="spellEnd"/>
+            <w:r>
+              <w:t>)</w:t>
             </w:r>
           </w:p>
         </w:tc>
@@ -2188,19 +2561,27 @@
             <w:r>
               <w:t>type=</w:t>
             </w:r>
-            <w:proofErr w:type="gramStart"/>
+            <w:proofErr w:type="spellStart"/>
             <w:r>
               <w:t>faiss:hnsw</w:t>
             </w:r>
-            <w:proofErr w:type="gramEnd"/>
-            <w:r>
-              <w:t xml:space="preserve"> (M=32, efConstruction=200) with automatic </w:t>
-            </w:r>
-            <w:proofErr w:type="gramStart"/>
+            <w:proofErr w:type="spellEnd"/>
+            <w:r>
+              <w:t xml:space="preserve"> (M=32, </w:t>
+            </w:r>
+            <w:proofErr w:type="spellStart"/>
+            <w:r>
+              <w:t>efConstruction</w:t>
+            </w:r>
+            <w:proofErr w:type="spellEnd"/>
+            <w:r>
+              <w:t xml:space="preserve">=200) with automatic </w:t>
+            </w:r>
+            <w:proofErr w:type="spellStart"/>
             <w:r>
               <w:t>faiss:flat</w:t>
             </w:r>
-            <w:proofErr w:type="gramEnd"/>
+            <w:proofErr w:type="spellEnd"/>
             <w:r>
               <w:t xml:space="preserve"> fallback below a safety margin</w:t>
             </w:r>
@@ -2277,63 +2658,103 @@
           </w:tcPr>
           <w:p>
             <w:r>
-              <w:t xml:space="preserve">pages → deskew/denoise/binarize → (enhance: not implemented, skipped) → layout (Tesseract line detection) → OCR (Tesseract-ben, gold/silver CER-gated) → chunk (256/32 sliding window) → embed (multilingual-e5-base) → store (FAISS HNSW/flat). Changed from the default: </w:t>
-            </w:r>
-            <w:proofErr w:type="gramStart"/>
+              <w:t xml:space="preserve">pages → </w:t>
+            </w:r>
+            <w:proofErr w:type="spellStart"/>
+            <w:r>
+              <w:t>deskew</w:t>
+            </w:r>
+            <w:proofErr w:type="spellEnd"/>
+            <w:r>
+              <w:t xml:space="preserve">/denoise/binarize → (enhance: not implemented, skipped) → layout (Tesseract line detection) → OCR (Tesseract-ben, gold/silver CER-gated) → chunk (256/32 sliding window) → embed (multilingual-e5-base) → store (FAISS HNSW/flat). Changed from the default: </w:t>
+            </w:r>
+            <w:proofErr w:type="spellStart"/>
             <w:r>
               <w:t>config.yaml's</w:t>
             </w:r>
-            <w:proofErr w:type="gramEnd"/>
+            <w:proofErr w:type="spellEnd"/>
             <w:r>
               <w:t xml:space="preserve"> </w:t>
             </w:r>
-            <w:proofErr w:type="gramStart"/>
+            <w:proofErr w:type="spellStart"/>
             <w:r>
               <w:t>enhance.enabled</w:t>
             </w:r>
-            <w:proofErr w:type="gramEnd"/>
-            <w:r>
-              <w:t xml:space="preserve"> was flipped from its original true to false (E1/severely-degraded-scans enhancement isn't gated for this group's chosen speciality, E26 dirty-ocr) rather than implementing enhance.py's still-stubbed Enhancer.apply(). With </w:t>
-            </w:r>
-            <w:proofErr w:type="gramStart"/>
+            <w:proofErr w:type="spellEnd"/>
+            <w:r>
+              <w:t xml:space="preserve"> was flipped from its original true to false (E1/severely-degraded-scans enhancement isn't gated for this group's chosen </w:t>
+            </w:r>
+            <w:proofErr w:type="spellStart"/>
+            <w:r>
+              <w:t>speciality</w:t>
+            </w:r>
+            <w:proofErr w:type="spellEnd"/>
+            <w:r>
+              <w:t>, E26 dirty-</w:t>
+            </w:r>
+            <w:proofErr w:type="spellStart"/>
+            <w:r>
+              <w:t>ocr</w:t>
+            </w:r>
+            <w:proofErr w:type="spellEnd"/>
+            <w:r>
+              <w:t xml:space="preserve">) rather than implementing </w:t>
+            </w:r>
+            <w:proofErr w:type="spellStart"/>
+            <w:r>
+              <w:t>enhance.py's</w:t>
+            </w:r>
+            <w:proofErr w:type="spellEnd"/>
+            <w:r>
+              <w:t xml:space="preserve"> still-stubbed </w:t>
+            </w:r>
+            <w:proofErr w:type="spellStart"/>
+            <w:r>
+              <w:t>Enhancer.apply</w:t>
+            </w:r>
+            <w:proofErr w:type="spellEnd"/>
+            <w:r>
+              <w:t xml:space="preserve">(). With </w:t>
+            </w:r>
+            <w:proofErr w:type="spellStart"/>
             <w:r>
               <w:t>enhance.enabled</w:t>
             </w:r>
-            <w:proofErr w:type="gramEnd"/>
+            <w:proofErr w:type="spellEnd"/>
             <w:r>
               <w:t xml:space="preserve">: false, </w:t>
             </w:r>
-            <w:proofErr w:type="gramStart"/>
-            <w:r>
-              <w:t>enhance.run(</w:t>
-            </w:r>
-            <w:proofErr w:type="gramEnd"/>
-            <w:r>
-              <w:t xml:space="preserve">) is a no-op passthrough, so </w:t>
-            </w:r>
-            <w:proofErr w:type="gramStart"/>
-            <w:r>
-              <w:t>pipeline.build</w:t>
-            </w:r>
-            <w:proofErr w:type="gramEnd"/>
-            <w:r>
-              <w:t>_knowledge_</w:t>
-            </w:r>
-            <w:proofErr w:type="gramStart"/>
-            <w:r>
-              <w:t>base(</w:t>
-            </w:r>
-            <w:proofErr w:type="gramEnd"/>
-            <w:r>
-              <w:t>) now runs end-to-end without hitting that stub. kb_</w:t>
-            </w:r>
-            <w:proofErr w:type="gramStart"/>
-            <w:r>
-              <w:t>demo.ipynb</w:t>
-            </w:r>
-            <w:proofErr w:type="gramEnd"/>
-            <w:r>
-              <w:t xml:space="preserve"> still calls preprocess→layout→OCR directly rather than the full pipeline function, but that's to score only the 10 gold-labelled sample pages, not to dodge a crash.</w:t>
+            <w:proofErr w:type="spellStart"/>
+            <w:r>
+              <w:t>enhance.run</w:t>
+            </w:r>
+            <w:proofErr w:type="spellEnd"/>
+            <w:r>
+              <w:t xml:space="preserve">() is a no-op passthrough, so </w:t>
+            </w:r>
+            <w:proofErr w:type="spellStart"/>
+            <w:r>
+              <w:t>pipeline.build_knowledge_base</w:t>
+            </w:r>
+            <w:proofErr w:type="spellEnd"/>
+            <w:r>
+              <w:t xml:space="preserve">() now runs end-to-end without hitting that stub. </w:t>
+            </w:r>
+            <w:proofErr w:type="spellStart"/>
+            <w:r>
+              <w:t>kb_demo.ipynb</w:t>
+            </w:r>
+            <w:proofErr w:type="spellEnd"/>
+            <w:r>
+              <w:t xml:space="preserve"> still calls </w:t>
+            </w:r>
+            <w:proofErr w:type="spellStart"/>
+            <w:r>
+              <w:t>preprocess→layout→OCR</w:t>
+            </w:r>
+            <w:proofErr w:type="spellEnd"/>
+            <w:r>
+              <w:t xml:space="preserve"> directly rather than the full pipeline function, but that's to score only the 10 gold-labelled sample pages, not to dodge a crash.</w:t>
             </w:r>
           </w:p>
         </w:tc>
@@ -2430,7 +2851,31 @@
           </w:tcPr>
           <w:p>
             <w:r>
-              <w:t>Line-level mean CER = 0.0967, mean WER = 0.3371, measured against grading_kit/labels.jsonl's 10 independently human-reviewed gold pages (261 aligned lines total), computed live in notebooks/kb_demo.ipynb Section 1. WER is naturally far higher than CER for OCR (a single wrong character fails the whole word) — the math checks out: mean word length 5.01 chars × 9.67% CER predicts ~40% word-error under an independence assumption, close to what we measure. We also found and fixed a real WER-inflation bug: Tesseract emits trailing punctuation as a separate token, adding a spurious space before Bengali sentence-final marks that cost 2 word-errors for a 1-character difference — fixing the tokenization (not the OCR itself) alone dropped naive WER from 0.3999 to 0.3371.</w:t>
+              <w:t xml:space="preserve">Line-level mean CER = 0.0967, mean WER = 0.3371, measured against </w:t>
+            </w:r>
+            <w:proofErr w:type="spellStart"/>
+            <w:r>
+              <w:t>grading_kit</w:t>
+            </w:r>
+            <w:proofErr w:type="spellEnd"/>
+            <w:r>
+              <w:t>/</w:t>
+            </w:r>
+            <w:proofErr w:type="spellStart"/>
+            <w:r>
+              <w:t>labels.jsonl's</w:t>
+            </w:r>
+            <w:proofErr w:type="spellEnd"/>
+            <w:r>
+              <w:t xml:space="preserve"> 10 independently human-reviewed gold pages (261 aligned lines total), computed live in notebooks/</w:t>
+            </w:r>
+            <w:proofErr w:type="spellStart"/>
+            <w:r>
+              <w:t>kb_demo.ipynb</w:t>
+            </w:r>
+            <w:proofErr w:type="spellEnd"/>
+            <w:r>
+              <w:t xml:space="preserve"> Section 1. WER is naturally far higher than CER for OCR (a single wrong character fails the whole word) — the math checks out: mean word length 5.01 chars × 9.67% CER predicts ~40% word-error under an independence assumption, close to what we measure. We also found and fixed a real WER-inflation bug: Tesseract emits trailing punctuation as a separate token, adding a spurious space before Bengali sentence-final marks that cost 2 word-errors for a 1-character difference — fixing the tokenization (not the OCR itself) alone dropped naive WER from 0.3999 to 0.3371.</w:t>
             </w:r>
           </w:p>
         </w:tc>
@@ -2487,25 +2932,82 @@
           </w:tcPr>
           <w:p>
             <w:r>
-              <w:t xml:space="preserve">As of our latest completed full-corpus run: 833 raw pages across 6 works OCR'd; 209 distinct pages contributed at least one accepted line; 2,671 lines accepted (540 gold / 2,131 silver) into 103 retrieval-sized chunks (~25,758 words post-merge); embedding dimension 768; index type </w:t>
-            </w:r>
-            <w:proofErr w:type="gramStart"/>
+              <w:t>As of our final full-corpus run (notebooks/</w:t>
+            </w:r>
+            <w:proofErr w:type="spellStart"/>
+            <w:r>
+              <w:t>kb_demo.ipynb</w:t>
+            </w:r>
+            <w:proofErr w:type="spellEnd"/>
+            <w:r>
+              <w:t xml:space="preserve"> Sections 2-4, real committed data at data/processed/</w:t>
+            </w:r>
+            <w:proofErr w:type="spellStart"/>
+            <w:r>
+              <w:t>ocr_meta.jsonl</w:t>
+            </w:r>
+            <w:proofErr w:type="spellEnd"/>
+            <w:r>
+              <w:t xml:space="preserve"> and data/processed/index/): 396 raw pages across 5 works </w:t>
+            </w:r>
+            <w:proofErr w:type="spellStart"/>
+            <w:r>
+              <w:t>OCR'd</w:t>
+            </w:r>
+            <w:proofErr w:type="spellEnd"/>
+            <w:r>
+              <w:t xml:space="preserve"> (rachanabali_vol25 removed as a likely duplicate — see below), 10,436 lines processed; 7,292 lines accepted (21 gold / 7,271 silver) into 279 retrieval-sized chunks; embedding dimension 768; index type </w:t>
+            </w:r>
+            <w:proofErr w:type="spellStart"/>
             <w:r>
               <w:t>faiss:hnsw</w:t>
             </w:r>
-            <w:proofErr w:type="gramEnd"/>
-            <w:r>
-              <w:t xml:space="preserve"> (auto-falls back to </w:t>
-            </w:r>
-            <w:proofErr w:type="gramStart"/>
-            <w:r>
-              <w:t>faiss:flat</w:t>
-            </w:r>
-            <w:proofErr w:type="gramEnd"/>
-            <w:r>
-              <w:t xml:space="preserve"> below a safety-margin chunk count). Corpus coverage: 209/833 pages (~25%) — remaining pages either lack any gold/silver reference yet, or belong to rachanabali_vol25 (437 flat, unsplit pages we believe duplicate the 5 already-split work folders and have deliberately not prioritized labeling).</w:t>
-            </w:r>
-          </w:p>
+            <w:proofErr w:type="spellEnd"/>
+            <w:r>
+              <w:t xml:space="preserve">. Corpus coverage: 337 pages contributed at least one accepted line. Mean CER on accepted lines: 6.69%. Chunks per document: </w:t>
+            </w:r>
+            <w:proofErr w:type="spellStart"/>
+            <w:r>
+              <w:t>bishwaparichay</w:t>
+            </w:r>
+            <w:proofErr w:type="spellEnd"/>
+            <w:r>
+              <w:t xml:space="preserve"> 101, </w:t>
+            </w:r>
+            <w:proofErr w:type="spellStart"/>
+            <w:r>
+              <w:t>tin_sangi</w:t>
+            </w:r>
+            <w:proofErr w:type="spellEnd"/>
+            <w:r>
+              <w:t xml:space="preserve"> 124, </w:t>
+            </w:r>
+            <w:proofErr w:type="spellStart"/>
+            <w:r>
+              <w:t>arogya</w:t>
+            </w:r>
+            <w:proofErr w:type="spellEnd"/>
+            <w:r>
+              <w:t xml:space="preserve"> 27, </w:t>
+            </w:r>
+            <w:proofErr w:type="spellStart"/>
+            <w:r>
+              <w:t>chandalika</w:t>
+            </w:r>
+            <w:proofErr w:type="spellEnd"/>
+            <w:r>
+              <w:t xml:space="preserve"> 18, </w:t>
+            </w:r>
+            <w:proofErr w:type="spellStart"/>
+            <w:r>
+              <w:t>chitrangada</w:t>
+            </w:r>
+            <w:proofErr w:type="spellEnd"/>
+            <w:r>
+              <w:t xml:space="preserve"> 9.</w:t>
+            </w:r>
+          </w:p>
+          <w:p/>
         </w:tc>
       </w:tr>
       <w:tr>
@@ -2563,59 +3065,117 @@
             <w:r>
               <w:t>Query "</w:t>
             </w:r>
+            <w:proofErr w:type="spellStart"/>
             <w:r>
               <w:rPr>
                 <w:rFonts w:ascii="Nirmala UI" w:hAnsi="Nirmala UI" w:cs="Nirmala UI"/>
               </w:rPr>
-              <w:t>দেবতা</w:t>
-            </w:r>
+              <w:t>পৃথিবীর</w:t>
+            </w:r>
+            <w:proofErr w:type="spellEnd"/>
             <w:r>
               <w:t xml:space="preserve"> </w:t>
             </w:r>
+            <w:proofErr w:type="spellStart"/>
             <w:r>
               <w:rPr>
                 <w:rFonts w:ascii="Nirmala UI" w:hAnsi="Nirmala UI" w:cs="Nirmala UI"/>
               </w:rPr>
-              <w:t>ওগো</w:t>
-            </w:r>
+              <w:t>টানে</w:t>
+            </w:r>
+            <w:proofErr w:type="spellEnd"/>
             <w:r>
               <w:t xml:space="preserve"> </w:t>
             </w:r>
+            <w:proofErr w:type="spellStart"/>
             <w:r>
               <w:rPr>
                 <w:rFonts w:ascii="Nirmala UI" w:hAnsi="Nirmala UI" w:cs="Nirmala UI"/>
               </w:rPr>
-              <w:t>তোমার</w:t>
-            </w:r>
+              <w:t>চন্দ্র</w:t>
+            </w:r>
+            <w:proofErr w:type="spellEnd"/>
             <w:r>
               <w:t xml:space="preserve"> </w:t>
             </w:r>
+            <w:proofErr w:type="spellStart"/>
             <w:r>
               <w:rPr>
                 <w:rFonts w:ascii="Nirmala UI" w:hAnsi="Nirmala UI" w:cs="Nirmala UI"/>
               </w:rPr>
-              <w:t>সেবা</w:t>
-            </w:r>
-            <w:r>
-              <w:t xml:space="preserve">" (a real phrase copied verbatim from the interior of chunk chandalika_c00002's own OCR'd text, the "flower" personification passage in Chandalika, not paraphrased or hand-written) against the real built index (the 3-page real sample: chandalika/arogya/tin_sangi, 19 chunks, not yet the full corpus) returns chandalika_c00002 (page chandalika_p0161) as the top hit, score 0.8206, correctly beating chunks from the other two unrelated documents/pages in the sample: arogya_c00003 (score 0.7951) and tin_sangi_c00000 (score 0.7900). This is a real cross-document semantic-discrimination check run directly against </w:t>
-            </w:r>
-            <w:proofErr w:type="gramStart"/>
+              <w:t>পৃথিবীর</w:t>
+            </w:r>
+            <w:proofErr w:type="spellEnd"/>
+            <w:r>
+              <w:t xml:space="preserve"> </w:t>
+            </w:r>
+            <w:proofErr w:type="spellStart"/>
+            <w:r>
+              <w:rPr>
+                <w:rFonts w:ascii="Nirmala UI" w:hAnsi="Nirmala UI" w:cs="Nirmala UI"/>
+              </w:rPr>
+              <w:t>চার</w:t>
+            </w:r>
+            <w:proofErr w:type="spellEnd"/>
+            <w:r>
+              <w:t xml:space="preserve"> </w:t>
+            </w:r>
+            <w:proofErr w:type="spellStart"/>
+            <w:r>
+              <w:rPr>
+                <w:rFonts w:ascii="Nirmala UI" w:hAnsi="Nirmala UI" w:cs="Nirmala UI"/>
+              </w:rPr>
+              <w:t>দিকে</w:t>
+            </w:r>
+            <w:proofErr w:type="spellEnd"/>
+            <w:r>
+              <w:t xml:space="preserve"> </w:t>
+            </w:r>
+            <w:proofErr w:type="spellStart"/>
+            <w:r>
+              <w:rPr>
+                <w:rFonts w:ascii="Nirmala UI" w:hAnsi="Nirmala UI" w:cs="Nirmala UI"/>
+              </w:rPr>
+              <w:t>ঘুরছে</w:t>
+            </w:r>
+            <w:proofErr w:type="spellEnd"/>
+            <w:r>
+              <w:t>" (the moon orbits the earth due to earth's gravitational pull) against the real, full-corpus index (</w:t>
+            </w:r>
+            <w:proofErr w:type="spellStart"/>
+            <w:r>
+              <w:t>kb_demo.ipynb</w:t>
+            </w:r>
+            <w:proofErr w:type="spellEnd"/>
+            <w:r>
+              <w:t xml:space="preserve"> Section 5, loaded via </w:t>
+            </w:r>
+            <w:proofErr w:type="spellStart"/>
             <w:r>
               <w:t>store.load</w:t>
             </w:r>
-            <w:proofErr w:type="gramEnd"/>
-            <w:r>
-              <w:t>() and faiss_</w:t>
-            </w:r>
-            <w:proofErr w:type="gramStart"/>
-            <w:r>
-              <w:t>index.search</w:t>
-            </w:r>
-            <w:proofErr w:type="gramEnd"/>
-            <w:r>
-              <w:t>(), not a synthetic demo.</w:t>
-            </w:r>
-          </w:p>
+            <w:proofErr w:type="spellEnd"/>
+            <w:r>
+              <w:t xml:space="preserve">() from the committed data/processed/index/) returns bishwaparichay_c00075 as the top hit, score 0.833 — correct, since </w:t>
+            </w:r>
+            <w:proofErr w:type="spellStart"/>
+            <w:r>
+              <w:t>Bishwaparichay</w:t>
+            </w:r>
+            <w:proofErr w:type="spellEnd"/>
+            <w:r>
+              <w:t xml:space="preserve"> is Tagore's own science-education primer and this is an astronomy topic. The next two hits (0.827, 0.818) are also from </w:t>
+            </w:r>
+            <w:proofErr w:type="spellStart"/>
+            <w:r>
+              <w:t>bishwaparichay</w:t>
+            </w:r>
+            <w:proofErr w:type="spellEnd"/>
+            <w:r>
+              <w:t>, topically coherent.</w:t>
+            </w:r>
+          </w:p>
+          <w:p/>
         </w:tc>
       </w:tr>
       <w:tr>
@@ -2670,17 +3230,18 @@
           </w:tcPr>
           <w:p>
             <w:r>
-              <w:t xml:space="preserve">Data-quality, not model failure: </w:t>
-            </w:r>
-            <w:proofErr w:type="gramStart"/>
-            <w:r>
-              <w:t>chandalika.jsonl</w:t>
-            </w:r>
-            <w:proofErr w:type="gramEnd"/>
-            <w:r>
-              <w:t xml:space="preserve"> (one of our bulk “gold” reference files) was found to be JSON-corrupted from partway through, and once repaired, roughly half of its pages turned out to contain real, accurately-transcribed text from two entirely different Tagore plays (Shyama, Parishodh) mislabeled under Chandalika's page IDs — almost certainly because the raw page-image split drew its page-range boundary too wide from the original 437-page volume. We caught this by content inspection, not by any automated check, and resolved it defensively by re-routing chandalika's coverage entirely through the (more conservative) silver CER gate rather than trusting the bulk gold claim — but the underlying raw-image mislabeling itself is still unfixed and worth flagging for A3.</w:t>
-            </w:r>
-          </w:p>
+              <w:t>Retrieval-level, measured at full scale (</w:t>
+            </w:r>
+            <w:proofErr w:type="spellStart"/>
+            <w:r>
+              <w:t>kb_demo.ipynb</w:t>
+            </w:r>
+            <w:proofErr w:type="spellEnd"/>
+            <w:r>
+              <w:t xml:space="preserve"> Section 6): tested every one of the 279 real chunks' own opening words as a self-retrieval query. Self-retrieval success rate rises sharply with query length — 12.9% at 5 words, 36.6% at 15 words, 68.8% at 30 words — confirming that short/generic queries are genuinely unreliable against our real index, not just a small-demo artifact. This is the full-scale confirmation of the risk already flagged in Section 9 below, and is why reranking and evidence-gated re-search matter for A3.</w:t>
+            </w:r>
+          </w:p>
+          <w:p/>
         </w:tc>
       </w:tr>
     </w:tbl>
@@ -2759,60 +3320,9 @@
                 <w:sz w:val="18"/>
                 <w:szCs w:val="18"/>
               </w:rPr>
-              <w:t>retrieval + rerank, the agent loop + tools, guardrails/HITL, grounding, evaluation — and RL/RLVR if you attempt the bonus.</w:t>
-            </w:r>
-          </w:p>
-          <w:p>
-            <w:r>
-              <w:t>Carry the agent forward: in A3 it must do evidence-gated re-search (widen k on weak evidence, abstain at k_max) — the mandatory agentic behaviour, graded fail-closed in A3.</w:t>
-            </w:r>
-          </w:p>
-        </w:tc>
-        <w:tc>
-          <w:tcPr>
-            <w:tcW w:w="5863" w:type="dxa"/>
-            <w:tcBorders>
-              <w:top w:val="single" w:sz="4" w:space="0" w:color="000000"/>
-              <w:left w:val="single" w:sz="4" w:space="0" w:color="000000"/>
-              <w:bottom w:val="single" w:sz="4" w:space="0" w:color="000000"/>
-              <w:right w:val="single" w:sz="4" w:space="0" w:color="000000"/>
-            </w:tcBorders>
-          </w:tcPr>
-          <w:p>
-            <w:r>
-              <w:t>retrieval/retriever.py (currently a NotImplementedError stub — k/k_step/k_max/weak_threshold are pre-declared in config.yaml), the agent loop + tool registry (agent/agent.py, agent/tools.py), cross-encoder reranking, evidence-gated re-search (widen k on weak top-score, abstain at k_max — the mandatory agentic behaviour, graded fail-closed), and PII/guardrails wiring (governance/pii.py's hook currently also raises NotImplementedError unconditionally on AFTER_OCR, the second of two stubs blocking pipeline.build_knowledge_base() from running end-to-end today).</w:t>
-            </w:r>
-          </w:p>
-        </w:tc>
-      </w:tr>
-      <w:tr>
-        <w:tc>
-          <w:tcPr>
-            <w:tcW w:w="3497" w:type="dxa"/>
-            <w:tcBorders>
-              <w:top w:val="single" w:sz="4" w:space="0" w:color="000000"/>
-              <w:left w:val="single" w:sz="4" w:space="0" w:color="000000"/>
-              <w:bottom w:val="single" w:sz="4" w:space="0" w:color="000000"/>
-              <w:right w:val="single" w:sz="4" w:space="0" w:color="000000"/>
-            </w:tcBorders>
-            <w:shd w:val="clear" w:color="auto" w:fill="F2F2F2"/>
-          </w:tcPr>
-          <w:p>
-            <w:pPr>
-              <w:spacing w:after="80"/>
-            </w:pPr>
-            <w:r>
-              <w:rPr>
-                <w:b/>
-                <w:bCs/>
-              </w:rPr>
-              <w:t>Our evaluation set</w:t>
-            </w:r>
-          </w:p>
-          <w:p>
-            <w:pPr>
-              <w:spacing w:after="80"/>
-            </w:pPr>
+              <w:t xml:space="preserve">retrieval + </w:t>
+            </w:r>
+            <w:proofErr w:type="spellStart"/>
             <w:r>
               <w:rPr>
                 <w:i/>
@@ -2821,9 +3331,9 @@
                 <w:sz w:val="18"/>
                 <w:szCs w:val="18"/>
               </w:rPr>
-              <w:t xml:space="preserve">how you'll write </w:t>
-            </w:r>
-            <w:proofErr w:type="gramStart"/>
+              <w:t>rerank</w:t>
+            </w:r>
+            <w:proofErr w:type="spellEnd"/>
             <w:r>
               <w:rPr>
                 <w:i/>
@@ -2832,9 +3342,156 @@
                 <w:sz w:val="18"/>
                 <w:szCs w:val="18"/>
               </w:rPr>
-              <w:t>tasks.jsonl</w:t>
-            </w:r>
-            <w:proofErr w:type="gramEnd"/>
+              <w:t>, the agent loop + tools, guardrails/HITL, grounding, evaluation — and RL/RLVR if you attempt the bonus.</w:t>
+            </w:r>
+          </w:p>
+          <w:p>
+            <w:r>
+              <w:t xml:space="preserve">Carry the agent forward: in A3 it must do evidence-gated re-search (widen k on weak evidence, abstain at </w:t>
+            </w:r>
+            <w:proofErr w:type="spellStart"/>
+            <w:r>
+              <w:t>k_max</w:t>
+            </w:r>
+            <w:proofErr w:type="spellEnd"/>
+            <w:r>
+              <w:t xml:space="preserve">) — the mandatory agentic </w:t>
+            </w:r>
+            <w:proofErr w:type="spellStart"/>
+            <w:r>
+              <w:t>behaviour</w:t>
+            </w:r>
+            <w:proofErr w:type="spellEnd"/>
+            <w:r>
+              <w:t>, graded fail-closed in A3.</w:t>
+            </w:r>
+          </w:p>
+        </w:tc>
+        <w:tc>
+          <w:tcPr>
+            <w:tcW w:w="5863" w:type="dxa"/>
+            <w:tcBorders>
+              <w:top w:val="single" w:sz="4" w:space="0" w:color="000000"/>
+              <w:left w:val="single" w:sz="4" w:space="0" w:color="000000"/>
+              <w:bottom w:val="single" w:sz="4" w:space="0" w:color="000000"/>
+              <w:right w:val="single" w:sz="4" w:space="0" w:color="000000"/>
+            </w:tcBorders>
+          </w:tcPr>
+          <w:p>
+            <w:r>
+              <w:t xml:space="preserve">retrieval/retriever.py (currently a </w:t>
+            </w:r>
+            <w:proofErr w:type="spellStart"/>
+            <w:r>
+              <w:t>NotImplementedError</w:t>
+            </w:r>
+            <w:proofErr w:type="spellEnd"/>
+            <w:r>
+              <w:t xml:space="preserve"> stub — k/</w:t>
+            </w:r>
+            <w:proofErr w:type="spellStart"/>
+            <w:r>
+              <w:t>k_step</w:t>
+            </w:r>
+            <w:proofErr w:type="spellEnd"/>
+            <w:r>
+              <w:t>/</w:t>
+            </w:r>
+            <w:proofErr w:type="spellStart"/>
+            <w:r>
+              <w:t>k_max</w:t>
+            </w:r>
+            <w:proofErr w:type="spellEnd"/>
+            <w:r>
+              <w:t>/</w:t>
+            </w:r>
+            <w:proofErr w:type="spellStart"/>
+            <w:r>
+              <w:t>weak_threshold</w:t>
+            </w:r>
+            <w:proofErr w:type="spellEnd"/>
+            <w:r>
+              <w:t xml:space="preserve"> are pre-declared in </w:t>
+            </w:r>
+            <w:proofErr w:type="spellStart"/>
+            <w:r>
+              <w:t>config.yaml</w:t>
+            </w:r>
+            <w:proofErr w:type="spellEnd"/>
+            <w:r>
+              <w:t xml:space="preserve">), the agent loop + tool registry (agent/agent.py, agent/tools.py), cross-encoder reranking, evidence-gated re-search (widen k on weak top-score, abstain at </w:t>
+            </w:r>
+            <w:proofErr w:type="spellStart"/>
+            <w:r>
+              <w:t>k_max</w:t>
+            </w:r>
+            <w:proofErr w:type="spellEnd"/>
+            <w:r>
+              <w:t xml:space="preserve"> — the mandatory agentic </w:t>
+            </w:r>
+            <w:proofErr w:type="spellStart"/>
+            <w:r>
+              <w:t>behaviour</w:t>
+            </w:r>
+            <w:proofErr w:type="spellEnd"/>
+            <w:r>
+              <w:t>, graded fail-closed), and PII/guardrails wiring (governance/</w:t>
+            </w:r>
+            <w:proofErr w:type="spellStart"/>
+            <w:r>
+              <w:t>pii.py's</w:t>
+            </w:r>
+            <w:proofErr w:type="spellEnd"/>
+            <w:r>
+              <w:t xml:space="preserve"> hook currently also raises </w:t>
+            </w:r>
+            <w:proofErr w:type="spellStart"/>
+            <w:r>
+              <w:t>NotImplementedError</w:t>
+            </w:r>
+            <w:proofErr w:type="spellEnd"/>
+            <w:r>
+              <w:t xml:space="preserve"> unconditionally on AFTER_OCR, the second of two stubs blocking </w:t>
+            </w:r>
+            <w:proofErr w:type="spellStart"/>
+            <w:r>
+              <w:t>pipeline.build_knowledge_base</w:t>
+            </w:r>
+            <w:proofErr w:type="spellEnd"/>
+            <w:r>
+              <w:t>() from running end-to-end today).</w:t>
+            </w:r>
+          </w:p>
+        </w:tc>
+      </w:tr>
+      <w:tr>
+        <w:tc>
+          <w:tcPr>
+            <w:tcW w:w="3497" w:type="dxa"/>
+            <w:tcBorders>
+              <w:top w:val="single" w:sz="4" w:space="0" w:color="000000"/>
+              <w:left w:val="single" w:sz="4" w:space="0" w:color="000000"/>
+              <w:bottom w:val="single" w:sz="4" w:space="0" w:color="000000"/>
+              <w:right w:val="single" w:sz="4" w:space="0" w:color="000000"/>
+            </w:tcBorders>
+            <w:shd w:val="clear" w:color="auto" w:fill="F2F2F2"/>
+          </w:tcPr>
+          <w:p>
+            <w:pPr>
+              <w:spacing w:after="80"/>
+            </w:pPr>
+            <w:r>
+              <w:rPr>
+                <w:b/>
+                <w:bCs/>
+              </w:rPr>
+              <w:t>Our evaluation set</w:t>
+            </w:r>
+          </w:p>
+          <w:p>
+            <w:pPr>
+              <w:spacing w:after="80"/>
+            </w:pPr>
             <w:r>
               <w:rPr>
                 <w:i/>
@@ -2843,55 +3500,9 @@
                 <w:sz w:val="18"/>
                 <w:szCs w:val="18"/>
               </w:rPr>
-              <w:t xml:space="preserve"> for YOUR domain — the questions your real user would ask; include enough checkable (verifiable) items and abstention cases.</w:t>
-            </w:r>
-          </w:p>
-        </w:tc>
-        <w:tc>
-          <w:tcPr>
-            <w:tcW w:w="5863" w:type="dxa"/>
-            <w:tcBorders>
-              <w:top w:val="single" w:sz="4" w:space="0" w:color="000000"/>
-              <w:left w:val="single" w:sz="4" w:space="0" w:color="000000"/>
-              <w:bottom w:val="single" w:sz="4" w:space="0" w:color="000000"/>
-              <w:right w:val="single" w:sz="4" w:space="0" w:color="000000"/>
-            </w:tcBorders>
-          </w:tcPr>
-          <w:p>
-            <w:r>
-              <w:t>grading_kit/tasks.jsonl, authored against our actual indexed content (the 5 works with real gold/silver coverage), mixing verifiable questions (checkable by exact page/line citation) with judged questions (summary/causal, LLM-judge or human scored) and deliberate out-of-corpus abstention cases, per the primary Explainable NFR's citation+tier disclosure requirement.</w:t>
-            </w:r>
-          </w:p>
-        </w:tc>
-      </w:tr>
-      <w:tr>
-        <w:tc>
-          <w:tcPr>
-            <w:tcW w:w="3497" w:type="dxa"/>
-            <w:tcBorders>
-              <w:top w:val="single" w:sz="4" w:space="0" w:color="000000"/>
-              <w:left w:val="single" w:sz="4" w:space="0" w:color="000000"/>
-              <w:bottom w:val="single" w:sz="4" w:space="0" w:color="000000"/>
-              <w:right w:val="single" w:sz="4" w:space="0" w:color="000000"/>
-            </w:tcBorders>
-            <w:shd w:val="clear" w:color="auto" w:fill="F2F2F2"/>
-          </w:tcPr>
-          <w:p>
-            <w:pPr>
-              <w:spacing w:after="80"/>
-            </w:pPr>
-            <w:r>
-              <w:rPr>
-                <w:b/>
-                <w:bCs/>
-              </w:rPr>
-              <w:t>Biggest risk / unknown</w:t>
-            </w:r>
-          </w:p>
-          <w:p>
-            <w:pPr>
-              <w:spacing w:after="80"/>
-            </w:pPr>
+              <w:t xml:space="preserve">how you'll write </w:t>
+            </w:r>
+            <w:proofErr w:type="spellStart"/>
             <w:r>
               <w:rPr>
                 <w:i/>
@@ -2900,6 +3511,95 @@
                 <w:sz w:val="18"/>
                 <w:szCs w:val="18"/>
               </w:rPr>
+              <w:t>tasks.jsonl</w:t>
+            </w:r>
+            <w:proofErr w:type="spellEnd"/>
+            <w:r>
+              <w:rPr>
+                <w:i/>
+                <w:iCs/>
+                <w:color w:val="595959"/>
+                <w:sz w:val="18"/>
+                <w:szCs w:val="18"/>
+              </w:rPr>
+              <w:t xml:space="preserve"> for YOUR domain — the questions your real user would ask; include enough checkable (verifiable) items and abstention cases.</w:t>
+            </w:r>
+          </w:p>
+        </w:tc>
+        <w:tc>
+          <w:tcPr>
+            <w:tcW w:w="5863" w:type="dxa"/>
+            <w:tcBorders>
+              <w:top w:val="single" w:sz="4" w:space="0" w:color="000000"/>
+              <w:left w:val="single" w:sz="4" w:space="0" w:color="000000"/>
+              <w:bottom w:val="single" w:sz="4" w:space="0" w:color="000000"/>
+              <w:right w:val="single" w:sz="4" w:space="0" w:color="000000"/>
+            </w:tcBorders>
+          </w:tcPr>
+          <w:p>
+            <w:proofErr w:type="spellStart"/>
+            <w:r>
+              <w:t>grading_kit</w:t>
+            </w:r>
+            <w:proofErr w:type="spellEnd"/>
+            <w:r>
+              <w:t>/</w:t>
+            </w:r>
+            <w:proofErr w:type="spellStart"/>
+            <w:r>
+              <w:t>tasks.jsonl</w:t>
+            </w:r>
+            <w:proofErr w:type="spellEnd"/>
+            <w:r>
+              <w:t xml:space="preserve">, authored against our actual indexed content (the 5 works with real gold/silver coverage), mixing verifiable questions (checkable by exact page/line citation) with judged questions (summary/causal, LLM-judge or human scored) and deliberate out-of-corpus abstention cases, per the primary Explainable NFR's </w:t>
+            </w:r>
+            <w:proofErr w:type="spellStart"/>
+            <w:r>
+              <w:t>citation+tier</w:t>
+            </w:r>
+            <w:proofErr w:type="spellEnd"/>
+            <w:r>
+              <w:t xml:space="preserve"> disclosure requirement.</w:t>
+            </w:r>
+          </w:p>
+        </w:tc>
+      </w:tr>
+      <w:tr>
+        <w:tc>
+          <w:tcPr>
+            <w:tcW w:w="3497" w:type="dxa"/>
+            <w:tcBorders>
+              <w:top w:val="single" w:sz="4" w:space="0" w:color="000000"/>
+              <w:left w:val="single" w:sz="4" w:space="0" w:color="000000"/>
+              <w:bottom w:val="single" w:sz="4" w:space="0" w:color="000000"/>
+              <w:right w:val="single" w:sz="4" w:space="0" w:color="000000"/>
+            </w:tcBorders>
+            <w:shd w:val="clear" w:color="auto" w:fill="F2F2F2"/>
+          </w:tcPr>
+          <w:p>
+            <w:pPr>
+              <w:spacing w:after="80"/>
+            </w:pPr>
+            <w:r>
+              <w:rPr>
+                <w:b/>
+                <w:bCs/>
+              </w:rPr>
+              <w:t>Biggest risk / unknown</w:t>
+            </w:r>
+          </w:p>
+          <w:p>
+            <w:pPr>
+              <w:spacing w:after="80"/>
+            </w:pPr>
+            <w:r>
+              <w:rPr>
+                <w:i/>
+                <w:iCs/>
+                <w:color w:val="595959"/>
+                <w:sz w:val="18"/>
+                <w:szCs w:val="18"/>
+              </w:rPr>
               <w:t>the thing most likely to break in A3, and your first idea to handle it.</w:t>
             </w:r>
           </w:p>
@@ -2916,13 +3616,42 @@
           </w:tcPr>
           <w:p>
             <w:r>
-              <w:t xml:space="preserve">Two, in order of how much A3 evidence they'd invalidate if unresolved: (1) rachanabali_vol25's likely duplication of the 5 already-split works — if true and left in the raw corpus, it risks wasted OCR compute and document-level train/val/test leakage, since the same underlying text could appear under two different </w:t>
-            </w:r>
-            <w:r>
-              <w:lastRenderedPageBreak/>
-              <w:t>doc_ids in different splits; (2) short/generic queries not reliably returning the obviously-intended top-1 chunk (already observed on our synthetic demo corpus, kb_demo.ipynb Section 6) — reranking and evidence-gated re-search are meant to catch exactly this, and A3 needs to verify they actually do, not just that they exist.</w:t>
-            </w:r>
-          </w:p>
+              <w:t>short/generic queries not reliably returning the intended top-1 chunk — now measured directly at full corpus scale (</w:t>
+            </w:r>
+            <w:proofErr w:type="spellStart"/>
+            <w:r>
+              <w:t>kb_demo.ipynb</w:t>
+            </w:r>
+            <w:proofErr w:type="spellEnd"/>
+            <w:r>
+              <w:t xml:space="preserve"> Section 6): only 12.9% self-retrieval success at 5-word query length. Reranking and evidence-gated re-search (</w:t>
+            </w:r>
+            <w:proofErr w:type="spellStart"/>
+            <w:r>
+              <w:t>retriever.py's</w:t>
+            </w:r>
+            <w:proofErr w:type="spellEnd"/>
+            <w:r>
+              <w:t xml:space="preserve"> stubbed </w:t>
+            </w:r>
+            <w:proofErr w:type="spellStart"/>
+            <w:r>
+              <w:t>is_weak</w:t>
+            </w:r>
+            <w:proofErr w:type="spellEnd"/>
+            <w:r>
+              <w:t>()/</w:t>
+            </w:r>
+            <w:proofErr w:type="spellStart"/>
+            <w:r>
+              <w:t>next_k</w:t>
+            </w:r>
+            <w:proofErr w:type="spellEnd"/>
+            <w:r>
+              <w:t>()) are meant to catch exactly this; A3 needs to verify they actually do.</w:t>
+            </w:r>
+          </w:p>
+          <w:p/>
         </w:tc>
       </w:tr>
     </w:tbl>
@@ -2938,7 +3667,25 @@
           <w:color w:val="1F3864"/>
         </w:rPr>
         <w:lastRenderedPageBreak/>
-        <w:t>Section 7 — Design Choices &amp; Justification (knowledge-base stages)</w:t>
+        <w:t>Section 7 — Design Choices &amp; Justification (knowledge-</w:t>
+      </w:r>
+      <w:proofErr w:type="spellStart"/>
+      <w:r>
+        <w:rPr>
+          <w:b/>
+          <w:bCs/>
+          <w:color w:val="1F3864"/>
+        </w:rPr>
+        <w:t>base</w:t>
+      </w:r>
+      <w:proofErr w:type="spellEnd"/>
+      <w:r>
+        <w:rPr>
+          <w:b/>
+          <w:bCs/>
+          <w:color w:val="1F3864"/>
+        </w:rPr>
+        <w:t xml:space="preserve"> stages)</w:t>
       </w:r>
     </w:p>
     <w:p>
@@ -3023,31 +3770,49 @@
                 <w:bCs/>
                 <w:color w:val="FFFFFF"/>
               </w:rPr>
-              <w:t>Our choice across the knowledge-base stages</w:t>
-            </w:r>
-          </w:p>
-        </w:tc>
-        <w:tc>
-          <w:tcPr>
-            <w:tcW w:w="3760" w:type="dxa"/>
-            <w:tcBorders>
-              <w:top w:val="single" w:sz="4" w:space="0" w:color="000000"/>
-              <w:left w:val="single" w:sz="4" w:space="0" w:color="000000"/>
-              <w:bottom w:val="single" w:sz="4" w:space="0" w:color="000000"/>
-              <w:right w:val="single" w:sz="4" w:space="0" w:color="000000"/>
-            </w:tcBorders>
-            <w:shd w:val="clear" w:color="auto" w:fill="1F3864"/>
-          </w:tcPr>
-          <w:p>
-            <w:pPr>
-              <w:spacing w:after="80"/>
-            </w:pPr>
+              <w:t>Our choice across the knowledge-</w:t>
+            </w:r>
+            <w:proofErr w:type="spellStart"/>
             <w:r>
               <w:rPr>
                 <w:b/>
                 <w:bCs/>
                 <w:color w:val="FFFFFF"/>
               </w:rPr>
+              <w:t>base</w:t>
+            </w:r>
+            <w:proofErr w:type="spellEnd"/>
+            <w:r>
+              <w:rPr>
+                <w:b/>
+                <w:bCs/>
+                <w:color w:val="FFFFFF"/>
+              </w:rPr>
+              <w:t xml:space="preserve"> stages</w:t>
+            </w:r>
+          </w:p>
+        </w:tc>
+        <w:tc>
+          <w:tcPr>
+            <w:tcW w:w="3760" w:type="dxa"/>
+            <w:tcBorders>
+              <w:top w:val="single" w:sz="4" w:space="0" w:color="000000"/>
+              <w:left w:val="single" w:sz="4" w:space="0" w:color="000000"/>
+              <w:bottom w:val="single" w:sz="4" w:space="0" w:color="000000"/>
+              <w:right w:val="single" w:sz="4" w:space="0" w:color="000000"/>
+            </w:tcBorders>
+            <w:shd w:val="clear" w:color="auto" w:fill="1F3864"/>
+          </w:tcPr>
+          <w:p>
+            <w:pPr>
+              <w:spacing w:after="80"/>
+            </w:pPr>
+            <w:r>
+              <w:rPr>
+                <w:b/>
+                <w:bCs/>
+                <w:color w:val="FFFFFF"/>
+              </w:rPr>
               <w:t>Why — fits our corpus · what it costs · what would change it</w:t>
             </w:r>
           </w:p>
@@ -3085,7 +3850,23 @@
           </w:tcPr>
           <w:p>
             <w:r>
-              <w:t>Given a scanned Rachanabali (Vol. 25) page, answer a question with a page/line citation and an explicit silver/gold evidence-tier disclosure, or abstain. Groundedness ≥ 0.80 (ECR).</w:t>
+              <w:t xml:space="preserve">Given a scanned </w:t>
+            </w:r>
+            <w:proofErr w:type="spellStart"/>
+            <w:r>
+              <w:t>Rachanabali</w:t>
+            </w:r>
+            <w:proofErr w:type="spellEnd"/>
+            <w:r>
+              <w:t xml:space="preserve"> (Vol. 25) page, answer a question with a page/line citation and an explicit silver/gold evidence-tier disclosure, or abstain. </w:t>
+            </w:r>
+            <w:proofErr w:type="spellStart"/>
+            <w:r>
+              <w:t>Groundedness</w:t>
+            </w:r>
+            <w:proofErr w:type="spellEnd"/>
+            <w:r>
+              <w:t xml:space="preserve"> ≥ 0.80 (ECR).</w:t>
             </w:r>
           </w:p>
         </w:tc>
@@ -3101,13 +3882,21 @@
           </w:tcPr>
           <w:p>
             <w:r>
-              <w:t xml:space="preserve">Fits: matches the Explainable NFR chosen in A1. Cost: requires carrying confidence+tier metadata through every stage despite </w:t>
-            </w:r>
-            <w:proofErr w:type="gramStart"/>
+              <w:t xml:space="preserve">Fits: matches the Explainable NFR chosen in A1. Cost: requires carrying </w:t>
+            </w:r>
+            <w:proofErr w:type="spellStart"/>
+            <w:r>
+              <w:t>confidence+tier</w:t>
+            </w:r>
+            <w:proofErr w:type="spellEnd"/>
+            <w:r>
+              <w:t xml:space="preserve"> metadata through every stage despite </w:t>
+            </w:r>
+            <w:proofErr w:type="spellStart"/>
             <w:r>
               <w:t>contracts.Chunk</w:t>
             </w:r>
-            <w:proofErr w:type="gramEnd"/>
+            <w:proofErr w:type="spellEnd"/>
             <w:r>
               <w:t xml:space="preserve"> having no field for it (solved via JSONL sidecars). Would change: if grounded-citation cost became the latency bottleneck, not accuracy.</w:t>
             </w:r>
@@ -3146,7 +3935,79 @@
           </w:tcPr>
           <w:p>
             <w:r>
-              <w:t>437 scanned pages, CC0-1.0, split by literary work (not page) — 65%/22%/13% train/val/test by word count. Labels: silver-only from IA-style references (dirty-ocr); gold only where independently human-reviewed (grading_kit/labels.jsonl, 10 pages) or from bulk per-work files (arogya/tin_sangi partial; chandalika/chitrangada/bishwaparichay fully superseded by silver after a real mislabeling was found).</w:t>
+              <w:t>437 scanned pages, CC0-1.0, split by literary work (not page) — 65%/22%/13% train/</w:t>
+            </w:r>
+            <w:proofErr w:type="spellStart"/>
+            <w:r>
+              <w:t>val</w:t>
+            </w:r>
+            <w:proofErr w:type="spellEnd"/>
+            <w:r>
+              <w:t>/test by word count. Labels: silver-only from IA-style references (dirty-</w:t>
+            </w:r>
+            <w:proofErr w:type="spellStart"/>
+            <w:r>
+              <w:t>ocr</w:t>
+            </w:r>
+            <w:proofErr w:type="spellEnd"/>
+            <w:r>
+              <w:t>); gold only where independently human-reviewed (</w:t>
+            </w:r>
+            <w:proofErr w:type="spellStart"/>
+            <w:r>
+              <w:t>grading_kit</w:t>
+            </w:r>
+            <w:proofErr w:type="spellEnd"/>
+            <w:r>
+              <w:t>/</w:t>
+            </w:r>
+            <w:proofErr w:type="spellStart"/>
+            <w:r>
+              <w:t>labels.jsonl</w:t>
+            </w:r>
+            <w:proofErr w:type="spellEnd"/>
+            <w:r>
+              <w:t>, 10 pages) or from bulk per-work files (</w:t>
+            </w:r>
+            <w:proofErr w:type="spellStart"/>
+            <w:r>
+              <w:t>arogya</w:t>
+            </w:r>
+            <w:proofErr w:type="spellEnd"/>
+            <w:r>
+              <w:t>/</w:t>
+            </w:r>
+            <w:proofErr w:type="spellStart"/>
+            <w:r>
+              <w:t>tin_sangi</w:t>
+            </w:r>
+            <w:proofErr w:type="spellEnd"/>
+            <w:r>
+              <w:t xml:space="preserve"> partial; </w:t>
+            </w:r>
+            <w:proofErr w:type="spellStart"/>
+            <w:r>
+              <w:t>chandalika</w:t>
+            </w:r>
+            <w:proofErr w:type="spellEnd"/>
+            <w:r>
+              <w:t>/</w:t>
+            </w:r>
+            <w:proofErr w:type="spellStart"/>
+            <w:r>
+              <w:t>chitrangada</w:t>
+            </w:r>
+            <w:proofErr w:type="spellEnd"/>
+            <w:r>
+              <w:t>/</w:t>
+            </w:r>
+            <w:proofErr w:type="spellStart"/>
+            <w:r>
+              <w:t>bishwaparichay</w:t>
+            </w:r>
+            <w:proofErr w:type="spellEnd"/>
+            <w:r>
+              <w:t xml:space="preserve"> fully superseded by silver after a real mislabeling was found).</w:t>
             </w:r>
           </w:p>
         </w:tc>
@@ -3162,7 +4023,23 @@
           </w:tcPr>
           <w:p>
             <w:r>
-              <w:t>Fits: document-level split prevents leakage; the dirty-ocr speciality means CER-gated tiers are load-bearing, not decorative. Cost: real gold coverage is still thin (209/833 pages have any accepted line at all). Would change: if we get a reliable page-to-original-volume alignment (IA's own djvu.txt OCR), which we investigated but found isn't a simple page-number mapping.</w:t>
+              <w:t>Fits: document-level split prevents leakage; the dirty-</w:t>
+            </w:r>
+            <w:proofErr w:type="spellStart"/>
+            <w:r>
+              <w:t>ocr</w:t>
+            </w:r>
+            <w:proofErr w:type="spellEnd"/>
+            <w:r>
+              <w:t xml:space="preserve"> </w:t>
+            </w:r>
+            <w:proofErr w:type="spellStart"/>
+            <w:r>
+              <w:t>speciality</w:t>
+            </w:r>
+            <w:proofErr w:type="spellEnd"/>
+            <w:r>
+              <w:t xml:space="preserve"> means CER-gated tiers are load-bearing, not decorative. Cost: real gold coverage is still thin (209/833 pages have any accepted line at all). Would change: if we get a reliable page-to-original-volume alignment (IA's own djvu.txt OCR), which we investigated but found isn't a simple page-number mapping.</w:t>
             </w:r>
           </w:p>
         </w:tc>
@@ -3198,8 +4075,21 @@
             </w:tcBorders>
           </w:tcPr>
           <w:p>
-            <w:r>
-              <w:t>Layout+OCR: Tesseract-ben 4.1.1 (frozen). Embedding: intfloat/multilingual-e5-base (frozen, 768-dim). No neural OCR, no fine-tuning anywhere in the pipeline yet.</w:t>
+            <w:proofErr w:type="spellStart"/>
+            <w:r>
+              <w:t>Layout+OCR</w:t>
+            </w:r>
+            <w:proofErr w:type="spellEnd"/>
+            <w:r>
+              <w:t xml:space="preserve">: Tesseract-ben 4.1.1 (frozen). Embedding: </w:t>
+            </w:r>
+            <w:proofErr w:type="spellStart"/>
+            <w:r>
+              <w:t>intfloat</w:t>
+            </w:r>
+            <w:proofErr w:type="spellEnd"/>
+            <w:r>
+              <w:t>/multilingual-e5-base (frozen, 768-dim). No neural OCR, no fine-tuning anywhere in the pipeline yet.</w:t>
             </w:r>
           </w:p>
         </w:tc>
@@ -3215,13 +4105,21 @@
           </w:tcPr>
           <w:p>
             <w:r>
-              <w:t xml:space="preserve">Fits: CPU-only, no GPU dependency for the committed recognizer, and e5 explicitly supports Bengali for cross-lingual retrieval. Cost: Tesseract's ~9.67% CER is the accuracy ceiling until we revisit a fine-tuned option now that Kaggle GPU is available. Would change: if CER needs to drop further, we'd fine-tune TrOCR (already named in </w:t>
-            </w:r>
-            <w:proofErr w:type="gramStart"/>
+              <w:t xml:space="preserve">Fits: CPU-only, no GPU dependency for the committed recognizer, and e5 explicitly supports Bengali for cross-lingual retrieval. Cost: Tesseract's ~9.67% CER is the accuracy ceiling until we revisit a fine-tuned option now that Kaggle GPU is available. Would change: if CER needs to drop further, we'd fine-tune </w:t>
+            </w:r>
+            <w:proofErr w:type="spellStart"/>
+            <w:r>
+              <w:t>TrOCR</w:t>
+            </w:r>
+            <w:proofErr w:type="spellEnd"/>
+            <w:r>
+              <w:t xml:space="preserve"> (already named in </w:t>
+            </w:r>
+            <w:proofErr w:type="spellStart"/>
             <w:r>
               <w:t>config.yaml</w:t>
             </w:r>
-            <w:proofErr w:type="gramEnd"/>
+            <w:proofErr w:type="spellEnd"/>
             <w:r>
               <w:t>) rather than keep tuning Tesseract.</w:t>
             </w:r>
@@ -3260,11 +4158,96 @@
           </w:tcPr>
           <w:p>
             <w:r>
-              <w:t xml:space="preserve">Inference-only (no training this milestone): sliding-window chunking (256/32); CER-threshold silver gate (≤0.15) plus content-aware fuzzy line alignment (Needleman-Wunsch-style DP over Levenshtein similarity, tolerating up to a 2-line count </w:t>
+              <w:t xml:space="preserve">Inference-only (no training this milestone): sliding-window chunking (256/32); CER-threshold silver gate (≤0.15) plus content-aware fuzzy line alignment (Needleman-Wunsch-style DP over </w:t>
+            </w:r>
+            <w:proofErr w:type="spellStart"/>
+            <w:r>
+              <w:t>Levenshtein</w:t>
+            </w:r>
+            <w:proofErr w:type="spellEnd"/>
+            <w:r>
+              <w:t xml:space="preserve"> similarity, tolerating up to a 2-line count mismatch between OCR and reference) for both gold and silver matching.</w:t>
+            </w:r>
+          </w:p>
+        </w:tc>
+        <w:tc>
+          <w:tcPr>
+            <w:tcW w:w="3760" w:type="dxa"/>
+            <w:tcBorders>
+              <w:top w:val="single" w:sz="4" w:space="0" w:color="000000"/>
+              <w:left w:val="single" w:sz="4" w:space="0" w:color="000000"/>
+              <w:bottom w:val="single" w:sz="4" w:space="0" w:color="000000"/>
+              <w:right w:val="single" w:sz="4" w:space="0" w:color="000000"/>
+            </w:tcBorders>
+          </w:tcPr>
+          <w:p>
+            <w:r>
+              <w:t xml:space="preserve">Fits: the fuzzy alignment was necessary in practice — exact-line-count-only alignment (our original approach) accepted zero gold chunks from real </w:t>
+            </w:r>
+            <w:proofErr w:type="spellStart"/>
+            <w:r>
+              <w:t>heldout</w:t>
+            </w:r>
+            <w:proofErr w:type="spellEnd"/>
+            <w:r>
+              <w:t xml:space="preserve"> pages; the DP fix alone produced real accepted output. Cost: added complexity and a tunable similarity threshold (0.5) that could in principle over- or under-match. Would change: with reliable per-page IA reference text, we could relax the CER threshold instead of leaning on fuzzy alignment.</w:t>
+            </w:r>
+          </w:p>
+        </w:tc>
+      </w:tr>
+      <w:tr>
+        <w:tc>
+          <w:tcPr>
+            <w:tcW w:w="2197" w:type="dxa"/>
+            <w:tcBorders>
+              <w:top w:val="single" w:sz="4" w:space="0" w:color="000000"/>
+              <w:left w:val="single" w:sz="4" w:space="0" w:color="000000"/>
+              <w:bottom w:val="single" w:sz="4" w:space="0" w:color="000000"/>
+              <w:right w:val="single" w:sz="4" w:space="0" w:color="000000"/>
+            </w:tcBorders>
+          </w:tcPr>
+          <w:p>
+            <w:pPr>
+              <w:spacing w:after="80"/>
+            </w:pPr>
+            <w:r>
+              <w:t>Design</w:t>
+            </w:r>
+          </w:p>
+        </w:tc>
+        <w:tc>
+          <w:tcPr>
+            <w:tcW w:w="3403" w:type="dxa"/>
+            <w:tcBorders>
+              <w:top w:val="single" w:sz="4" w:space="0" w:color="000000"/>
+              <w:left w:val="single" w:sz="4" w:space="0" w:color="000000"/>
+              <w:bottom w:val="single" w:sz="4" w:space="0" w:color="000000"/>
+              <w:right w:val="single" w:sz="4" w:space="0" w:color="000000"/>
+            </w:tcBorders>
+          </w:tcPr>
+          <w:p>
+            <w:r>
+              <w:t xml:space="preserve">Fixed pipeline order (contracts.py, pipeline.py) with JSONL sidecars </w:t>
             </w:r>
             <w:r>
               <w:lastRenderedPageBreak/>
-              <w:t>mismatch between OCR and reference) for both gold and silver matching.</w:t>
+              <w:t xml:space="preserve">carrying confidence/tier through every stage; document-boundary isolation enforced in </w:t>
+            </w:r>
+            <w:proofErr w:type="spellStart"/>
+            <w:r>
+              <w:t>chunk.split</w:t>
+            </w:r>
+            <w:proofErr w:type="spellEnd"/>
+            <w:r>
+              <w:t xml:space="preserve">() (never merges lines across </w:t>
+            </w:r>
+            <w:proofErr w:type="spellStart"/>
+            <w:r>
+              <w:t>doc_id</w:t>
+            </w:r>
+            <w:proofErr w:type="spellEnd"/>
+            <w:r>
+              <w:t>).</w:t>
             </w:r>
           </w:p>
         </w:tc>
@@ -3281,11 +4264,35 @@
           <w:p>
             <w:r>
               <w:lastRenderedPageBreak/>
-              <w:t xml:space="preserve">Fits: the fuzzy alignment was necessary in practice — exact-line-count-only alignment (our original approach) accepted zero gold chunks from real heldout pages; the DP fix alone produced real accepted output. Cost: added complexity and a tunable similarity </w:t>
+              <w:t xml:space="preserve">Fits: sidecars let us add gold/silver disclosure without touching the locked </w:t>
             </w:r>
             <w:r>
               <w:lastRenderedPageBreak/>
-              <w:t>threshold (0.5) that could in principle over- or under-match. Would change: with reliable per-page IA reference text, we could relax the CER threshold instead of leaning on fuzzy alignment.</w:t>
+              <w:t>Chunk contract. Cost: three-hop metadata joins (</w:t>
+            </w:r>
+            <w:proofErr w:type="spellStart"/>
+            <w:r>
+              <w:t>ocr_meta</w:t>
+            </w:r>
+            <w:proofErr w:type="spellEnd"/>
+            <w:r>
+              <w:t xml:space="preserve"> → </w:t>
+            </w:r>
+            <w:proofErr w:type="spellStart"/>
+            <w:r>
+              <w:t>chunk_meta</w:t>
+            </w:r>
+            <w:proofErr w:type="spellEnd"/>
+            <w:r>
+              <w:t xml:space="preserve"> → </w:t>
+            </w:r>
+            <w:proofErr w:type="spellStart"/>
+            <w:r>
+              <w:t>chunks.jsonl</w:t>
+            </w:r>
+            <w:proofErr w:type="spellEnd"/>
+            <w:r>
+              <w:t>) that all have to stay correctly keyed. Would change: if contracts.py is ever unlocked, confidence/tier would move onto Chunk directly.</w:t>
             </w:r>
           </w:p>
         </w:tc>
@@ -3307,7 +4314,7 @@
             </w:pPr>
             <w:r>
               <w:lastRenderedPageBreak/>
-              <w:t>Design</w:t>
+              <w:t>Development</w:t>
             </w:r>
           </w:p>
         </w:tc>
@@ -3323,15 +4330,23 @@
           </w:tcPr>
           <w:p>
             <w:r>
-              <w:t xml:space="preserve">Fixed pipeline order (contracts.py, pipeline.py) with JSONL sidecars carrying confidence/tier through every stage; document-boundary isolation enforced in </w:t>
-            </w:r>
-            <w:proofErr w:type="gramStart"/>
-            <w:r>
-              <w:t>chunk.split</w:t>
-            </w:r>
-            <w:proofErr w:type="gramEnd"/>
-            <w:r>
-              <w:t>() (never merges lines across doc_id).</w:t>
+              <w:t>Unit-tested per stage (tests/test_retrieval.py, tests/test_ocr.py — chunk windowing/overlap/cross-doc isolation, embed shape/</w:t>
+            </w:r>
+            <w:proofErr w:type="spellStart"/>
+            <w:r>
+              <w:t>dtype</w:t>
+            </w:r>
+            <w:proofErr w:type="spellEnd"/>
+            <w:r>
+              <w:t>/norm, store round-trip + NN search, OCR alignment/gold/silver gating, all currently passing); config in configs/</w:t>
+            </w:r>
+            <w:proofErr w:type="spellStart"/>
+            <w:r>
+              <w:t>config.yaml</w:t>
+            </w:r>
+            <w:proofErr w:type="spellEnd"/>
+            <w:r>
+              <w:t>; experiment tracking not yet wired.</w:t>
             </w:r>
           </w:p>
         </w:tc>
@@ -3347,15 +4362,47 @@
           </w:tcPr>
           <w:p>
             <w:r>
-              <w:t xml:space="preserve">Fits: sidecars let us add gold/silver disclosure without touching the locked Chunk contract. Cost: three-hop metadata joins (ocr_meta → chunk_meta → </w:t>
-            </w:r>
-            <w:proofErr w:type="gramStart"/>
-            <w:r>
-              <w:t>chunks.jsonl</w:t>
-            </w:r>
-            <w:proofErr w:type="gramEnd"/>
-            <w:r>
-              <w:t>) that all have to stay correctly keyed. Would change: if contracts.py is ever unlocked, confidence/tier would move onto Chunk directly.</w:t>
+              <w:t xml:space="preserve">Fits: tests catch real regressions — a genuine chunk.py bug (reading the wrong sidecar key) was caught and regression-tested this way. Cost: kept local-only until now; the self-contained Kaggle notebook duplicates this logic rather than importing </w:t>
+            </w:r>
+            <w:proofErr w:type="spellStart"/>
+            <w:r>
+              <w:t>src</w:t>
+            </w:r>
+            <w:proofErr w:type="spellEnd"/>
+            <w:r>
+              <w:t>/</w:t>
+            </w:r>
+            <w:proofErr w:type="spellStart"/>
+            <w:r>
+              <w:t>doc_agent</w:t>
+            </w:r>
+            <w:proofErr w:type="spellEnd"/>
+            <w:r>
+              <w:t xml:space="preserve"> directly, so the two can drift if not kept in sync manually. Would change: packaging </w:t>
+            </w:r>
+            <w:proofErr w:type="spellStart"/>
+            <w:r>
+              <w:t>src</w:t>
+            </w:r>
+            <w:proofErr w:type="spellEnd"/>
+            <w:r>
+              <w:t>/</w:t>
+            </w:r>
+            <w:proofErr w:type="spellStart"/>
+            <w:r>
+              <w:t>doc_agent</w:t>
+            </w:r>
+            <w:proofErr w:type="spellEnd"/>
+            <w:r>
+              <w:t xml:space="preserve"> for pip-</w:t>
+            </w:r>
+            <w:proofErr w:type="spellStart"/>
+            <w:r>
+              <w:t>installability</w:t>
+            </w:r>
+            <w:proofErr w:type="spellEnd"/>
+            <w:r>
+              <w:t xml:space="preserve"> on Kaggle instead of duplicating code.</w:t>
             </w:r>
           </w:p>
         </w:tc>
@@ -3376,7 +4423,7 @@
               <w:spacing w:after="80"/>
             </w:pPr>
             <w:r>
-              <w:t>Development</w:t>
+              <w:t>Deployment</w:t>
             </w:r>
           </w:p>
         </w:tc>
@@ -3392,7 +4439,23 @@
           </w:tcPr>
           <w:p>
             <w:r>
-              <w:t>Unit-tested per stage (tests/test_retrieval.py, tests/test_ocr.py — chunk windowing/overlap/cross-doc isolation, embed shape/dtype/norm, store round-trip + NN search, OCR alignment/gold/silver gating, all currently passing); config in configs/config.yaml; experiment tracking not yet wired.</w:t>
+              <w:t xml:space="preserve">Batch, CPU-only locally; Kaggle notebook run with GPU available (falls back to CPU automatically via </w:t>
+            </w:r>
+            <w:proofErr w:type="spellStart"/>
+            <w:r>
+              <w:t>embed.py's</w:t>
+            </w:r>
+            <w:proofErr w:type="spellEnd"/>
+            <w:r>
+              <w:t xml:space="preserve"> _</w:t>
+            </w:r>
+            <w:proofErr w:type="spellStart"/>
+            <w:r>
+              <w:t>resolve_device</w:t>
+            </w:r>
+            <w:proofErr w:type="spellEnd"/>
+            <w:r>
+              <w:t>() if unavailable). Full 833-page corpus run completes end-to-end without a hard-fail on Kaggle.</w:t>
             </w:r>
           </w:p>
         </w:tc>
@@ -3408,7 +4471,15 @@
           </w:tcPr>
           <w:p>
             <w:r>
-              <w:t>Fits: tests catch real regressions — a genuine chunk.py bug (reading the wrong sidecar key) was caught and regression-tested this way. Cost: kept local-only until now; the self-contained Kaggle notebook duplicates this logic rather than importing src/doc_agent directly, so the two can drift if not kept in sync manually. Would change: packaging src/doc_agent for pip-installability on Kaggle instead of duplicating code.</w:t>
+              <w:t>Fits: matches our own no-GPU dev environment while still benefiting from Kaggle GPU when available. Cost: full-corpus runs still take real wall-clock time (</w:t>
+            </w:r>
+            <w:proofErr w:type="spellStart"/>
+            <w:r>
+              <w:t>preprocessing+layout+OCR</w:t>
+            </w:r>
+            <w:proofErr w:type="spellEnd"/>
+            <w:r>
+              <w:t xml:space="preserve"> dominates, not embedding). Would change: if faster turnaround is needed, batching Tesseract calls or a GPU-accelerated OCR engine would matter more than embedding speed.</w:t>
             </w:r>
           </w:p>
         </w:tc>
@@ -3428,9 +4499,11 @@
             <w:pPr>
               <w:spacing w:after="80"/>
             </w:pPr>
-            <w:r>
-              <w:t>Deployment</w:t>
-            </w:r>
+            <w:proofErr w:type="spellStart"/>
+            <w:r>
+              <w:t>MLOps</w:t>
+            </w:r>
+            <w:proofErr w:type="spellEnd"/>
           </w:p>
         </w:tc>
         <w:tc>
@@ -3445,15 +4518,7 @@
           </w:tcPr>
           <w:p>
             <w:r>
-              <w:t>Batch, CPU-only locally; Kaggle notebook run with GPU available (falls back to CPU automatically via embed.py's _resolve_</w:t>
-            </w:r>
-            <w:proofErr w:type="gramStart"/>
-            <w:r>
-              <w:t>device(</w:t>
-            </w:r>
-            <w:proofErr w:type="gramEnd"/>
-            <w:r>
-              <w:t>) if unavailable). Full 833-page corpus run completes end-to-end without a hard-fail on Kaggle.</w:t>
+              <w:t>Corpus versioning via data/versioning.py (content-hash based); no drift/quality monitoring wired yet.</w:t>
             </w:r>
           </w:p>
         </w:tc>
@@ -3469,60 +4534,15 @@
           </w:tcPr>
           <w:p>
             <w:r>
-              <w:t>Fits: matches our own no-GPU dev environment while still benefiting from Kaggle GPU when available. Cost: full-corpus runs still take real wall-clock time (preprocessing+layout+OCR dominates, not embedding). Would change: if faster turnaround is needed, batching Tesseract calls or a GPU-accelerated OCR engine would matter more than embedding speed.</w:t>
-            </w:r>
-          </w:p>
-        </w:tc>
-      </w:tr>
-      <w:tr>
-        <w:tc>
-          <w:tcPr>
-            <w:tcW w:w="2197" w:type="dxa"/>
-            <w:tcBorders>
-              <w:top w:val="single" w:sz="4" w:space="0" w:color="000000"/>
-              <w:left w:val="single" w:sz="4" w:space="0" w:color="000000"/>
-              <w:bottom w:val="single" w:sz="4" w:space="0" w:color="000000"/>
-              <w:right w:val="single" w:sz="4" w:space="0" w:color="000000"/>
-            </w:tcBorders>
-          </w:tcPr>
-          <w:p>
-            <w:pPr>
-              <w:spacing w:after="80"/>
-            </w:pPr>
-            <w:r>
-              <w:t>MLOps</w:t>
-            </w:r>
-          </w:p>
-        </w:tc>
-        <w:tc>
-          <w:tcPr>
-            <w:tcW w:w="3403" w:type="dxa"/>
-            <w:tcBorders>
-              <w:top w:val="single" w:sz="4" w:space="0" w:color="000000"/>
-              <w:left w:val="single" w:sz="4" w:space="0" w:color="000000"/>
-              <w:bottom w:val="single" w:sz="4" w:space="0" w:color="000000"/>
-              <w:right w:val="single" w:sz="4" w:space="0" w:color="000000"/>
-            </w:tcBorders>
-          </w:tcPr>
-          <w:p>
-            <w:r>
-              <w:t>Corpus versioning via data/versioning.py (content-hash based); no drift/quality monitoring wired yet.</w:t>
-            </w:r>
-          </w:p>
-        </w:tc>
-        <w:tc>
-          <w:tcPr>
-            <w:tcW w:w="3760" w:type="dxa"/>
-            <w:tcBorders>
-              <w:top w:val="single" w:sz="4" w:space="0" w:color="000000"/>
-              <w:left w:val="single" w:sz="4" w:space="0" w:color="000000"/>
-              <w:bottom w:val="single" w:sz="4" w:space="0" w:color="000000"/>
-              <w:right w:val="single" w:sz="4" w:space="0" w:color="000000"/>
-            </w:tcBorders>
-          </w:tcPr>
-          <w:p>
-            <w:r>
-              <w:t>Fits: enough for a static, one-time corpus this milestone. Cost: no automated check would catch a repeat of the chandalika mislabeling issue before it reaches gold. Would change: an automated cross-check (does a bulk-gold file's page range make sense against its own document's known start/end?) would be cheap insurance for A3.</w:t>
+              <w:t xml:space="preserve">Fits: enough for a static, one-time corpus this milestone. Cost: no automated check would catch a repeat of the </w:t>
+            </w:r>
+            <w:proofErr w:type="spellStart"/>
+            <w:r>
+              <w:t>chandalika</w:t>
+            </w:r>
+            <w:proofErr w:type="spellEnd"/>
+            <w:r>
+              <w:t xml:space="preserve"> mislabeling issue before it reaches gold. Would change: an automated cross-check (does a bulk-gold file's page range make sense against its own document's known start/end?) would be cheap insurance for A3.</w:t>
             </w:r>
           </w:p>
         </w:tc>
@@ -3539,7 +4559,6 @@
           <w:bCs/>
           <w:color w:val="1F3864"/>
         </w:rPr>
-        <w:lastRenderedPageBreak/>
         <w:t>Section 8 — How We Worked With AI</w:t>
       </w:r>
     </w:p>
@@ -3782,6 +4801,7 @@
           <w:bCs/>
           <w:color w:val="1F3864"/>
         </w:rPr>
+        <w:lastRenderedPageBreak/>
         <w:t>Submission — Required Folder Structure</w:t>
       </w:r>
     </w:p>
@@ -3790,7 +4810,15 @@
         <w:spacing w:after="100"/>
       </w:pPr>
       <w:r>
-        <w:t xml:space="preserve">The autograder enforces this exactly. ZIP named </w:t>
+        <w:t xml:space="preserve">The </w:t>
+      </w:r>
+      <w:proofErr w:type="spellStart"/>
+      <w:r>
+        <w:t>autograder</w:t>
+      </w:r>
+      <w:proofErr w:type="spellEnd"/>
+      <w:r>
+        <w:t xml:space="preserve"> enforces this exactly. ZIP named </w:t>
       </w:r>
       <w:r>
         <w:rPr>
@@ -3926,16 +4954,21 @@
             <w:pPr>
               <w:spacing w:after="80"/>
             </w:pPr>
-            <w:r>
-              <w:t>src/doc_agent</w:t>
-            </w:r>
-            <w:proofErr w:type="gramStart"/>
-            <w:r>
-              <w:t>/  (</w:t>
-            </w:r>
-            <w:proofErr w:type="gramEnd"/>
-            <w:r>
-              <w:t>ingest, vision, index)</w:t>
+            <w:proofErr w:type="spellStart"/>
+            <w:r>
+              <w:t>src</w:t>
+            </w:r>
+            <w:proofErr w:type="spellEnd"/>
+            <w:r>
+              <w:t>/</w:t>
+            </w:r>
+            <w:proofErr w:type="spellStart"/>
+            <w:r>
+              <w:t>doc_agent</w:t>
+            </w:r>
+            <w:proofErr w:type="spellEnd"/>
+            <w:r>
+              <w:t>/  (ingest, vision, index)</w:t>
             </w:r>
           </w:p>
         </w:tc>
@@ -3954,7 +4987,15 @@
               <w:spacing w:after="80"/>
             </w:pPr>
             <w:r>
-              <w:t>the implemented knowledge-base stages</w:t>
+              <w:t>the implemented knowledge-</w:t>
+            </w:r>
+            <w:proofErr w:type="spellStart"/>
+            <w:r>
+              <w:t>base</w:t>
+            </w:r>
+            <w:proofErr w:type="spellEnd"/>
+            <w:r>
+              <w:t xml:space="preserve"> stages</w:t>
             </w:r>
           </w:p>
         </w:tc>
@@ -4015,8 +5056,13 @@
               <w:spacing w:after="80"/>
             </w:pPr>
             <w:r>
-              <w:t>notebooks/kb_demo.ipynb</w:t>
-            </w:r>
+              <w:t>notebooks/</w:t>
+            </w:r>
+            <w:proofErr w:type="spellStart"/>
+            <w:r>
+              <w:t>kb_demo.ipynb</w:t>
+            </w:r>
+            <w:proofErr w:type="spellEnd"/>
           </w:p>
         </w:tc>
         <w:tc>
@@ -4074,7 +5120,15 @@
               <w:spacing w:after="80"/>
             </w:pPr>
             <w:r>
-              <w:t>a diagram of the knowledge-base pipeline (edit the stub)</w:t>
+              <w:t>a diagram of the knowledge-</w:t>
+            </w:r>
+            <w:proofErr w:type="spellStart"/>
+            <w:r>
+              <w:t>base</w:t>
+            </w:r>
+            <w:proofErr w:type="spellEnd"/>
+            <w:r>
+              <w:t xml:space="preserve"> pipeline (edit the stub)</w:t>
             </w:r>
           </w:p>
         </w:tc>
@@ -4135,15 +5189,7 @@
               <w:spacing w:after="80"/>
             </w:pPr>
             <w:r>
-              <w:t>transcripts/&lt;student number&gt;.</w:t>
-            </w:r>
-            <w:proofErr w:type="gramStart"/>
-            <w:r>
-              <w:t>txt  ×</w:t>
-            </w:r>
-            <w:proofErr w:type="gramEnd"/>
-            <w:r>
-              <w:t>3</w:t>
+              <w:t>transcripts/&lt;student number&gt;.txt  ×3</w:t>
             </w:r>
           </w:p>
         </w:tc>

</xml_diff>